<commit_message>
Modificare font si spatiere
</commit_message>
<xml_diff>
--- a/documentatie/Cosma_Rasvan_Casa.curs.valutar_BD.docx
+++ b/documentatie/Cosma_Rasvan_Casa.curs.valutar_BD.docx
@@ -4,98 +4,76 @@
   <w:body>
     <w:p>
       <w:pPr>
-        <w:spacing w:after="0"/>
+        <w:spacing w:after="0" w:line="360" w:lineRule="auto"/>
         <w:jc w:val="center"/>
         <w:rPr>
-          <w:b/>
-          <w:bCs/>
-        </w:rPr>
-      </w:pPr>
-    </w:p>
-    <w:p>
-      <w:pPr>
-        <w:spacing w:after="0"/>
+          <w:rFonts w:ascii="Times New Roman" w:hAnsi="Times New Roman" w:cs="Times New Roman"/>
+          <w:b/>
+          <w:bCs/>
+        </w:rPr>
+      </w:pPr>
+    </w:p>
+    <w:p>
+      <w:pPr>
+        <w:spacing w:after="0" w:line="360" w:lineRule="auto"/>
         <w:jc w:val="center"/>
         <w:rPr>
-          <w:b/>
-          <w:bCs/>
-        </w:rPr>
-      </w:pPr>
-    </w:p>
-    <w:p>
-      <w:pPr>
-        <w:spacing w:after="0"/>
+          <w:rFonts w:ascii="Times New Roman" w:hAnsi="Times New Roman" w:cs="Times New Roman"/>
+          <w:b/>
+          <w:bCs/>
+        </w:rPr>
+      </w:pPr>
+    </w:p>
+    <w:p>
+      <w:pPr>
+        <w:spacing w:after="0" w:line="360" w:lineRule="auto"/>
+        <w:rPr>
+          <w:rFonts w:ascii="Times New Roman" w:hAnsi="Times New Roman" w:cs="Times New Roman"/>
+          <w:b/>
+          <w:bCs/>
+        </w:rPr>
+      </w:pPr>
+    </w:p>
+    <w:p>
+      <w:pPr>
+        <w:spacing w:after="0" w:line="360" w:lineRule="auto"/>
         <w:jc w:val="center"/>
         <w:rPr>
-          <w:b/>
-          <w:bCs/>
-        </w:rPr>
-      </w:pPr>
-    </w:p>
-    <w:p>
-      <w:pPr>
-        <w:spacing w:after="0"/>
+          <w:rFonts w:ascii="Times New Roman" w:hAnsi="Times New Roman" w:cs="Times New Roman"/>
+          <w:b/>
+          <w:bCs/>
+        </w:rPr>
+      </w:pPr>
+      <w:r>
+        <w:rPr>
+          <w:rFonts w:ascii="Times New Roman" w:hAnsi="Times New Roman" w:cs="Times New Roman"/>
+          <w:b/>
+          <w:bCs/>
+        </w:rPr>
+        <w:t xml:space="preserve">Universitatea </w:t>
+      </w:r>
+      <w:r>
+        <w:rPr>
+          <w:rFonts w:ascii="Times New Roman" w:hAnsi="Times New Roman" w:cs="Times New Roman"/>
+          <w:b/>
+          <w:bCs/>
+        </w:rPr>
+        <w:t xml:space="preserve">Tehnică </w:t>
+      </w:r>
+    </w:p>
+    <w:p>
+      <w:pPr>
+        <w:spacing w:line="360" w:lineRule="auto"/>
         <w:jc w:val="center"/>
         <w:rPr>
-          <w:b/>
-          <w:bCs/>
-        </w:rPr>
-      </w:pPr>
-    </w:p>
-    <w:p>
-      <w:pPr>
-        <w:spacing w:after="0"/>
-        <w:jc w:val="center"/>
-        <w:rPr>
-          <w:b/>
-          <w:bCs/>
-        </w:rPr>
-      </w:pPr>
-    </w:p>
-    <w:p>
-      <w:pPr>
-        <w:spacing w:after="0"/>
-        <w:jc w:val="center"/>
-        <w:rPr>
-          <w:b/>
-          <w:bCs/>
-        </w:rPr>
-      </w:pPr>
-    </w:p>
-    <w:p>
-      <w:pPr>
-        <w:spacing w:after="0"/>
-        <w:jc w:val="center"/>
-        <w:rPr>
-          <w:b/>
-          <w:bCs/>
-        </w:rPr>
-      </w:pPr>
-      <w:r>
-        <w:rPr>
-          <w:b/>
-          <w:bCs/>
-        </w:rPr>
-        <w:t xml:space="preserve">Universitatea </w:t>
-      </w:r>
-      <w:r>
-        <w:rPr>
-          <w:b/>
-          <w:bCs/>
-        </w:rPr>
-        <w:t xml:space="preserve">Tehnică </w:t>
-      </w:r>
-    </w:p>
-    <w:p>
-      <w:pPr>
-        <w:jc w:val="center"/>
-        <w:rPr>
-          <w:b/>
-          <w:bCs/>
-        </w:rPr>
-      </w:pPr>
-      <w:r>
-        <w:rPr>
+          <w:rFonts w:ascii="Times New Roman" w:hAnsi="Times New Roman" w:cs="Times New Roman"/>
+          <w:b/>
+          <w:bCs/>
+        </w:rPr>
+      </w:pPr>
+      <w:r>
+        <w:rPr>
+          <w:rFonts w:ascii="Times New Roman" w:hAnsi="Times New Roman" w:cs="Times New Roman"/>
           <w:b/>
           <w:bCs/>
         </w:rPr>
@@ -103,6 +81,7 @@
       </w:r>
       <w:r>
         <w:rPr>
+          <w:rFonts w:ascii="Times New Roman" w:hAnsi="Times New Roman" w:cs="Times New Roman"/>
           <w:b/>
           <w:bCs/>
         </w:rPr>
@@ -111,6 +90,7 @@
       </w:r>
       <w:r>
         <w:rPr>
+          <w:rFonts w:ascii="Times New Roman" w:hAnsi="Times New Roman" w:cs="Times New Roman"/>
           <w:b/>
           <w:bCs/>
         </w:rPr>
@@ -118,6 +98,7 @@
       </w:r>
       <w:r>
         <w:rPr>
+          <w:rFonts w:ascii="Times New Roman" w:hAnsi="Times New Roman" w:cs="Times New Roman"/>
           <w:b/>
           <w:bCs/>
         </w:rPr>
@@ -126,6 +107,7 @@
       </w:r>
       <w:r>
         <w:rPr>
+          <w:rFonts w:ascii="Times New Roman" w:hAnsi="Times New Roman" w:cs="Times New Roman"/>
           <w:b/>
           <w:bCs/>
         </w:rPr>
@@ -134,71 +116,69 @@
     </w:p>
     <w:p>
       <w:pPr>
+        <w:spacing w:line="360" w:lineRule="auto"/>
         <w:jc w:val="center"/>
         <w:rPr>
-          <w:b/>
-          <w:bCs/>
-        </w:rPr>
-      </w:pPr>
-    </w:p>
-    <w:p>
-      <w:pPr>
+          <w:rFonts w:ascii="Times New Roman" w:hAnsi="Times New Roman" w:cs="Times New Roman"/>
+          <w:b/>
+          <w:bCs/>
+        </w:rPr>
+      </w:pPr>
+    </w:p>
+    <w:p>
+      <w:pPr>
+        <w:spacing w:line="360" w:lineRule="auto"/>
         <w:jc w:val="center"/>
         <w:rPr>
-          <w:b/>
-          <w:bCs/>
-        </w:rPr>
-      </w:pPr>
-    </w:p>
-    <w:p>
-      <w:pPr>
+          <w:rFonts w:ascii="Times New Roman" w:hAnsi="Times New Roman" w:cs="Times New Roman"/>
+          <w:b/>
+          <w:bCs/>
+        </w:rPr>
+      </w:pPr>
+    </w:p>
+    <w:p>
+      <w:pPr>
+        <w:spacing w:line="360" w:lineRule="auto"/>
         <w:jc w:val="center"/>
         <w:rPr>
-          <w:b/>
-          <w:bCs/>
-        </w:rPr>
-      </w:pPr>
-    </w:p>
-    <w:p>
-      <w:pPr>
+          <w:rFonts w:ascii="Times New Roman" w:hAnsi="Times New Roman" w:cs="Times New Roman"/>
+          <w:b/>
+          <w:bCs/>
+        </w:rPr>
+      </w:pPr>
+    </w:p>
+    <w:p>
+      <w:pPr>
+        <w:spacing w:line="360" w:lineRule="auto"/>
         <w:jc w:val="center"/>
         <w:rPr>
-          <w:b/>
-          <w:bCs/>
-        </w:rPr>
-      </w:pPr>
-      <w:r>
-        <w:rPr>
-          <w:b/>
-          <w:bCs/>
-        </w:rPr>
-        <w:t xml:space="preserve">— Disciplina: </w:t>
-      </w:r>
-      <w:r>
-        <w:rPr>
-          <w:b/>
-          <w:bCs/>
-        </w:rPr>
-        <w:t>Proiectarea</w:t>
-      </w:r>
-      <w:r>
-        <w:rPr>
-          <w:b/>
-          <w:bCs/>
-        </w:rPr>
-        <w:t xml:space="preserve"> Bazelor de Date —</w:t>
-      </w:r>
-    </w:p>
-    <w:p>
-      <w:pPr>
+          <w:rFonts w:ascii="Times New Roman" w:hAnsi="Times New Roman" w:cs="Times New Roman"/>
+          <w:b/>
+          <w:bCs/>
+        </w:rPr>
+      </w:pPr>
+      <w:r>
+        <w:rPr>
+          <w:rFonts w:ascii="Times New Roman" w:hAnsi="Times New Roman" w:cs="Times New Roman"/>
+          <w:b/>
+          <w:bCs/>
+        </w:rPr>
+        <w:t>— Disciplina: Proiectarea Bazelor de Date —</w:t>
+      </w:r>
+    </w:p>
+    <w:p>
+      <w:pPr>
+        <w:spacing w:line="360" w:lineRule="auto"/>
         <w:jc w:val="center"/>
         <w:rPr>
-          <w:b/>
-          <w:bCs/>
-        </w:rPr>
-      </w:pPr>
-      <w:r>
-        <w:rPr>
+          <w:rFonts w:ascii="Times New Roman" w:hAnsi="Times New Roman" w:cs="Times New Roman"/>
+          <w:b/>
+          <w:bCs/>
+        </w:rPr>
+      </w:pPr>
+      <w:r>
+        <w:rPr>
+          <w:rFonts w:ascii="Times New Roman" w:hAnsi="Times New Roman" w:cs="Times New Roman"/>
           <w:b/>
           <w:bCs/>
         </w:rPr>
@@ -206,6 +186,7 @@
       </w:r>
       <w:r>
         <w:rPr>
+          <w:rFonts w:ascii="Times New Roman" w:hAnsi="Times New Roman" w:cs="Times New Roman"/>
           <w:b/>
           <w:bCs/>
         </w:rPr>
@@ -213,6 +194,7 @@
       </w:r>
       <w:r>
         <w:rPr>
+          <w:rFonts w:ascii="Times New Roman" w:hAnsi="Times New Roman" w:cs="Times New Roman"/>
           <w:b/>
           <w:bCs/>
         </w:rPr>
@@ -220,6 +202,7 @@
       </w:r>
       <w:r>
         <w:rPr>
+          <w:rFonts w:ascii="Times New Roman" w:hAnsi="Times New Roman" w:cs="Times New Roman"/>
           <w:b/>
           <w:bCs/>
         </w:rPr>
@@ -227,6 +210,7 @@
       </w:r>
       <w:r>
         <w:rPr>
+          <w:rFonts w:ascii="Times New Roman" w:hAnsi="Times New Roman" w:cs="Times New Roman"/>
           <w:b/>
           <w:bCs/>
         </w:rPr>
@@ -234,6 +218,7 @@
       </w:r>
       <w:r>
         <w:rPr>
+          <w:rFonts w:ascii="Times New Roman" w:hAnsi="Times New Roman" w:cs="Times New Roman"/>
           <w:b/>
           <w:bCs/>
         </w:rPr>
@@ -241,6 +226,7 @@
       </w:r>
       <w:r>
         <w:rPr>
+          <w:rFonts w:ascii="Times New Roman" w:hAnsi="Times New Roman" w:cs="Times New Roman"/>
           <w:b/>
           <w:bCs/>
         </w:rPr>
@@ -249,66 +235,84 @@
     </w:p>
     <w:p>
       <w:pPr>
-        <w:rPr>
-          <w:b/>
-          <w:bCs/>
-        </w:rPr>
-      </w:pPr>
-    </w:p>
-    <w:p>
-      <w:pPr>
-        <w:rPr>
-          <w:b/>
-          <w:bCs/>
-        </w:rPr>
-      </w:pPr>
-    </w:p>
-    <w:p>
-      <w:pPr>
-        <w:rPr>
-          <w:b/>
-          <w:bCs/>
-        </w:rPr>
-      </w:pPr>
-    </w:p>
-    <w:p>
-      <w:pPr>
-        <w:rPr>
-          <w:b/>
-          <w:bCs/>
-        </w:rPr>
-      </w:pPr>
-    </w:p>
-    <w:p>
-      <w:pPr>
-        <w:rPr>
-          <w:b/>
-          <w:bCs/>
-        </w:rPr>
-      </w:pPr>
-    </w:p>
-    <w:p>
-      <w:pPr>
-        <w:rPr>
-          <w:b/>
-          <w:bCs/>
-        </w:rPr>
-      </w:pPr>
-    </w:p>
-    <w:p>
-      <w:pPr>
-        <w:rPr>
-          <w:b/>
-          <w:bCs/>
-        </w:rPr>
-      </w:pPr>
-    </w:p>
-    <w:p>
-      <w:pPr>
-        <w:spacing w:line="240" w:lineRule="auto"/>
-      </w:pPr>
-      <w:r>
-        <w:rPr>
+        <w:spacing w:line="360" w:lineRule="auto"/>
+        <w:rPr>
+          <w:rFonts w:ascii="Times New Roman" w:hAnsi="Times New Roman" w:cs="Times New Roman"/>
+          <w:b/>
+          <w:bCs/>
+        </w:rPr>
+      </w:pPr>
+    </w:p>
+    <w:p>
+      <w:pPr>
+        <w:spacing w:line="360" w:lineRule="auto"/>
+        <w:rPr>
+          <w:rFonts w:ascii="Times New Roman" w:hAnsi="Times New Roman" w:cs="Times New Roman"/>
+          <w:b/>
+          <w:bCs/>
+        </w:rPr>
+      </w:pPr>
+    </w:p>
+    <w:p>
+      <w:pPr>
+        <w:spacing w:line="360" w:lineRule="auto"/>
+        <w:rPr>
+          <w:rFonts w:ascii="Times New Roman" w:hAnsi="Times New Roman" w:cs="Times New Roman"/>
+          <w:b/>
+          <w:bCs/>
+        </w:rPr>
+      </w:pPr>
+    </w:p>
+    <w:p>
+      <w:pPr>
+        <w:spacing w:line="360" w:lineRule="auto"/>
+        <w:rPr>
+          <w:rFonts w:ascii="Times New Roman" w:hAnsi="Times New Roman" w:cs="Times New Roman"/>
+          <w:b/>
+          <w:bCs/>
+        </w:rPr>
+      </w:pPr>
+    </w:p>
+    <w:p>
+      <w:pPr>
+        <w:spacing w:line="360" w:lineRule="auto"/>
+        <w:rPr>
+          <w:rFonts w:ascii="Times New Roman" w:hAnsi="Times New Roman" w:cs="Times New Roman"/>
+          <w:b/>
+          <w:bCs/>
+        </w:rPr>
+      </w:pPr>
+    </w:p>
+    <w:p>
+      <w:pPr>
+        <w:spacing w:line="360" w:lineRule="auto"/>
+        <w:rPr>
+          <w:rFonts w:ascii="Times New Roman" w:hAnsi="Times New Roman" w:cs="Times New Roman"/>
+          <w:b/>
+          <w:bCs/>
+        </w:rPr>
+      </w:pPr>
+    </w:p>
+    <w:p>
+      <w:pPr>
+        <w:spacing w:line="360" w:lineRule="auto"/>
+        <w:rPr>
+          <w:rFonts w:ascii="Times New Roman" w:hAnsi="Times New Roman" w:cs="Times New Roman"/>
+          <w:b/>
+          <w:bCs/>
+        </w:rPr>
+      </w:pPr>
+    </w:p>
+    <w:p>
+      <w:pPr>
+        <w:spacing w:line="360" w:lineRule="auto"/>
+        <w:rPr>
+          <w:rFonts w:ascii="Times New Roman" w:hAnsi="Times New Roman" w:cs="Times New Roman"/>
+        </w:rPr>
+      </w:pPr>
+      <w:r>
+        <w:rPr>
+          <w:rFonts w:ascii="Times New Roman" w:hAnsi="Times New Roman" w:cs="Times New Roman"/>
           <w:b/>
           <w:bCs/>
         </w:rPr>
@@ -316,6 +320,7 @@
       </w:r>
       <w:r>
         <w:rPr>
+          <w:rFonts w:ascii="Times New Roman" w:hAnsi="Times New Roman" w:cs="Times New Roman"/>
           <w:b/>
           <w:bCs/>
         </w:rPr>
@@ -323,6 +328,7 @@
       </w:r>
       <w:r>
         <w:rPr>
+          <w:rFonts w:ascii="Times New Roman" w:hAnsi="Times New Roman" w:cs="Times New Roman"/>
           <w:b/>
           <w:bCs/>
         </w:rPr>
@@ -330,6 +336,7 @@
       </w:r>
       <w:r>
         <w:rPr>
+          <w:rFonts w:ascii="Times New Roman" w:hAnsi="Times New Roman" w:cs="Times New Roman"/>
           <w:b/>
           <w:bCs/>
         </w:rPr>
@@ -337,6 +344,7 @@
       </w:r>
       <w:r>
         <w:rPr>
+          <w:rFonts w:ascii="Times New Roman" w:hAnsi="Times New Roman" w:cs="Times New Roman"/>
           <w:b/>
           <w:bCs/>
         </w:rPr>
@@ -344,6 +352,7 @@
       </w:r>
       <w:r>
         <w:rPr>
+          <w:rFonts w:ascii="Times New Roman" w:hAnsi="Times New Roman" w:cs="Times New Roman"/>
           <w:b/>
           <w:bCs/>
         </w:rPr>
@@ -351,172 +360,207 @@
       </w:r>
       <w:r>
         <w:rPr>
+          <w:rFonts w:ascii="Times New Roman" w:hAnsi="Times New Roman" w:cs="Times New Roman"/>
           <w:b/>
           <w:bCs/>
         </w:rPr>
         <w:tab/>
-      </w:r>
-      <w:r>
-        <w:rPr>
-          <w:b/>
-          <w:bCs/>
-        </w:rPr>
-        <w:t xml:space="preserve"> </w:t>
-      </w:r>
-      <w:r>
-        <w:rPr>
-          <w:b/>
-          <w:bCs/>
-        </w:rPr>
-        <w:t>Student:</w:t>
-      </w:r>
-      <w:r>
+        <w:t xml:space="preserve"> Student:</w:t>
+      </w:r>
+      <w:r>
+        <w:rPr>
+          <w:rFonts w:ascii="Times New Roman" w:hAnsi="Times New Roman" w:cs="Times New Roman"/>
+        </w:rPr>
         <w:br/>
       </w:r>
       <w:r>
+        <w:rPr>
+          <w:rFonts w:ascii="Times New Roman" w:hAnsi="Times New Roman" w:cs="Times New Roman"/>
+        </w:rPr>
         <w:t>Văduva Bogdan</w:t>
       </w:r>
       <w:r>
+        <w:rPr>
+          <w:rFonts w:ascii="Times New Roman" w:hAnsi="Times New Roman" w:cs="Times New Roman"/>
+        </w:rPr>
         <w:tab/>
       </w:r>
       <w:r>
+        <w:rPr>
+          <w:rFonts w:ascii="Times New Roman" w:hAnsi="Times New Roman" w:cs="Times New Roman"/>
+        </w:rPr>
         <w:tab/>
       </w:r>
       <w:r>
+        <w:rPr>
+          <w:rFonts w:ascii="Times New Roman" w:hAnsi="Times New Roman" w:cs="Times New Roman"/>
+        </w:rPr>
         <w:tab/>
       </w:r>
       <w:r>
+        <w:rPr>
+          <w:rFonts w:ascii="Times New Roman" w:hAnsi="Times New Roman" w:cs="Times New Roman"/>
+        </w:rPr>
         <w:tab/>
       </w:r>
       <w:r>
+        <w:rPr>
+          <w:rFonts w:ascii="Times New Roman" w:hAnsi="Times New Roman" w:cs="Times New Roman"/>
+        </w:rPr>
         <w:tab/>
       </w:r>
       <w:r>
+        <w:rPr>
+          <w:rFonts w:ascii="Times New Roman" w:hAnsi="Times New Roman" w:cs="Times New Roman"/>
+        </w:rPr>
         <w:tab/>
       </w:r>
       <w:r>
+        <w:rPr>
+          <w:rFonts w:ascii="Times New Roman" w:hAnsi="Times New Roman" w:cs="Times New Roman"/>
+        </w:rPr>
         <w:tab/>
       </w:r>
       <w:r>
+        <w:rPr>
+          <w:rFonts w:ascii="Times New Roman" w:hAnsi="Times New Roman" w:cs="Times New Roman"/>
+        </w:rPr>
         <w:tab/>
         <w:t xml:space="preserve">Cosma Rasvan </w:t>
       </w:r>
     </w:p>
     <w:p>
       <w:pPr>
-        <w:rPr>
-          <w:b/>
-          <w:bCs/>
-        </w:rPr>
-      </w:pPr>
-      <w:r>
+        <w:spacing w:line="360" w:lineRule="auto"/>
+        <w:rPr>
+          <w:rFonts w:ascii="Times New Roman" w:hAnsi="Times New Roman" w:cs="Times New Roman"/>
+          <w:b/>
+          <w:bCs/>
+        </w:rPr>
+      </w:pPr>
+      <w:r>
+        <w:rPr>
+          <w:rFonts w:ascii="Times New Roman" w:hAnsi="Times New Roman" w:cs="Times New Roman"/>
+        </w:rPr>
         <w:tab/>
       </w:r>
       <w:r>
+        <w:rPr>
+          <w:rFonts w:ascii="Times New Roman" w:hAnsi="Times New Roman" w:cs="Times New Roman"/>
+        </w:rPr>
         <w:tab/>
       </w:r>
       <w:r>
+        <w:rPr>
+          <w:rFonts w:ascii="Times New Roman" w:hAnsi="Times New Roman" w:cs="Times New Roman"/>
+        </w:rPr>
         <w:tab/>
       </w:r>
       <w:r>
+        <w:rPr>
+          <w:rFonts w:ascii="Times New Roman" w:hAnsi="Times New Roman" w:cs="Times New Roman"/>
+        </w:rPr>
         <w:tab/>
       </w:r>
       <w:r>
+        <w:rPr>
+          <w:rFonts w:ascii="Times New Roman" w:hAnsi="Times New Roman" w:cs="Times New Roman"/>
+        </w:rPr>
         <w:tab/>
       </w:r>
       <w:r>
+        <w:rPr>
+          <w:rFonts w:ascii="Times New Roman" w:hAnsi="Times New Roman" w:cs="Times New Roman"/>
+        </w:rPr>
         <w:tab/>
       </w:r>
       <w:r>
+        <w:rPr>
+          <w:rFonts w:ascii="Times New Roman" w:hAnsi="Times New Roman" w:cs="Times New Roman"/>
+        </w:rPr>
         <w:tab/>
       </w:r>
       <w:r>
+        <w:rPr>
+          <w:rFonts w:ascii="Times New Roman" w:hAnsi="Times New Roman" w:cs="Times New Roman"/>
+        </w:rPr>
         <w:tab/>
       </w:r>
       <w:r>
+        <w:rPr>
+          <w:rFonts w:ascii="Times New Roman" w:hAnsi="Times New Roman" w:cs="Times New Roman"/>
+        </w:rPr>
         <w:tab/>
       </w:r>
       <w:r>
+        <w:rPr>
+          <w:rFonts w:ascii="Times New Roman" w:hAnsi="Times New Roman" w:cs="Times New Roman"/>
+        </w:rPr>
         <w:tab/>
       </w:r>
       <w:r>
         <w:rPr>
-          <w:b/>
-          <w:bCs/>
-        </w:rPr>
-        <w:t>Anul:</w:t>
-      </w:r>
-      <w:r>
-        <w:rPr>
-          <w:b/>
-          <w:bCs/>
-        </w:rPr>
-        <w:t xml:space="preserve"> </w:t>
-      </w:r>
-      <w:r>
+          <w:rFonts w:ascii="Times New Roman" w:hAnsi="Times New Roman" w:cs="Times New Roman"/>
+          <w:b/>
+          <w:bCs/>
+        </w:rPr>
+        <w:t xml:space="preserve">Anul: </w:t>
+      </w:r>
+      <w:r>
+        <w:rPr>
+          <w:rFonts w:ascii="Times New Roman" w:hAnsi="Times New Roman" w:cs="Times New Roman"/>
+        </w:rPr>
         <w:t>III</w:t>
       </w:r>
       <w:r>
+        <w:rPr>
+          <w:rFonts w:ascii="Times New Roman" w:hAnsi="Times New Roman" w:cs="Times New Roman"/>
+        </w:rPr>
         <w:br/>
       </w:r>
     </w:p>
     <w:p>
       <w:pPr>
-        <w:rPr>
-          <w:b/>
-          <w:bCs/>
-        </w:rPr>
-      </w:pPr>
-    </w:p>
-    <w:p>
-      <w:pPr>
-        <w:rPr>
-          <w:b/>
-          <w:bCs/>
-        </w:rPr>
-      </w:pPr>
-    </w:p>
-    <w:p>
-      <w:pPr>
-        <w:rPr>
-          <w:b/>
-          <w:bCs/>
-        </w:rPr>
-      </w:pPr>
-    </w:p>
-    <w:p>
-      <w:pPr>
-        <w:rPr>
-          <w:b/>
-          <w:bCs/>
-        </w:rPr>
-      </w:pPr>
-    </w:p>
-    <w:p>
-      <w:pPr>
-        <w:rPr>
-          <w:b/>
-          <w:bCs/>
-        </w:rPr>
-      </w:pPr>
-    </w:p>
-    <w:p>
-      <w:pPr>
-        <w:rPr>
-          <w:b/>
-          <w:bCs/>
-        </w:rPr>
-      </w:pPr>
-    </w:p>
-    <w:p>
-      <w:pPr>
-        <w:rPr>
-          <w:b/>
-          <w:bCs/>
-        </w:rPr>
-      </w:pPr>
-      <w:r>
-        <w:rPr>
+        <w:spacing w:line="360" w:lineRule="auto"/>
+        <w:rPr>
+          <w:rFonts w:ascii="Times New Roman" w:hAnsi="Times New Roman" w:cs="Times New Roman"/>
+          <w:b/>
+          <w:bCs/>
+        </w:rPr>
+      </w:pPr>
+    </w:p>
+    <w:p>
+      <w:pPr>
+        <w:spacing w:line="360" w:lineRule="auto"/>
+        <w:rPr>
+          <w:rFonts w:ascii="Times New Roman" w:hAnsi="Times New Roman" w:cs="Times New Roman"/>
+          <w:b/>
+          <w:bCs/>
+        </w:rPr>
+      </w:pPr>
+    </w:p>
+    <w:p>
+      <w:pPr>
+        <w:spacing w:line="360" w:lineRule="auto"/>
+        <w:rPr>
+          <w:rFonts w:ascii="Times New Roman" w:hAnsi="Times New Roman" w:cs="Times New Roman"/>
+          <w:b/>
+          <w:bCs/>
+        </w:rPr>
+      </w:pPr>
+    </w:p>
+    <w:p>
+      <w:pPr>
+        <w:spacing w:line="360" w:lineRule="auto"/>
+        <w:rPr>
+          <w:rFonts w:ascii="Times New Roman" w:hAnsi="Times New Roman" w:cs="Times New Roman"/>
+          <w:b/>
+          <w:bCs/>
+        </w:rPr>
+      </w:pPr>
+      <w:r>
+        <w:rPr>
+          <w:rFonts w:ascii="Times New Roman" w:hAnsi="Times New Roman" w:cs="Times New Roman"/>
           <w:b/>
           <w:bCs/>
         </w:rPr>
@@ -525,6 +569,7 @@
       </w:r>
       <w:r>
         <w:rPr>
+          <w:rFonts w:ascii="Times New Roman" w:hAnsi="Times New Roman" w:cs="Times New Roman"/>
           <w:b/>
           <w:bCs/>
           <w:lang w:val="en-US"/>
@@ -534,14 +579,17 @@
     </w:p>
     <w:p>
       <w:pPr>
+        <w:spacing w:line="360" w:lineRule="auto"/>
         <w:ind w:left="360"/>
         <w:rPr>
-          <w:sz w:val="26"/>
-          <w:szCs w:val="26"/>
-        </w:rPr>
-      </w:pPr>
-      <w:r>
-        <w:rPr>
+          <w:rFonts w:ascii="Times New Roman" w:hAnsi="Times New Roman" w:cs="Times New Roman"/>
+          <w:sz w:val="26"/>
+          <w:szCs w:val="26"/>
+        </w:rPr>
+      </w:pPr>
+      <w:r>
+        <w:rPr>
+          <w:rFonts w:ascii="Times New Roman" w:hAnsi="Times New Roman" w:cs="Times New Roman"/>
           <w:sz w:val="26"/>
           <w:szCs w:val="26"/>
         </w:rPr>
@@ -549,6 +597,7 @@
       </w:r>
       <w:r>
         <w:rPr>
+          <w:rFonts w:ascii="Times New Roman" w:hAnsi="Times New Roman" w:cs="Times New Roman"/>
           <w:sz w:val="26"/>
           <w:szCs w:val="26"/>
         </w:rPr>
@@ -557,14 +606,17 @@
     </w:p>
     <w:p>
       <w:pPr>
+        <w:spacing w:line="360" w:lineRule="auto"/>
         <w:ind w:left="360"/>
         <w:rPr>
-          <w:sz w:val="26"/>
-          <w:szCs w:val="26"/>
-        </w:rPr>
-      </w:pPr>
-      <w:r>
-        <w:rPr>
+          <w:rFonts w:ascii="Times New Roman" w:hAnsi="Times New Roman" w:cs="Times New Roman"/>
+          <w:sz w:val="26"/>
+          <w:szCs w:val="26"/>
+        </w:rPr>
+      </w:pPr>
+      <w:r>
+        <w:rPr>
+          <w:rFonts w:ascii="Times New Roman" w:hAnsi="Times New Roman" w:cs="Times New Roman"/>
           <w:sz w:val="26"/>
           <w:szCs w:val="26"/>
         </w:rPr>
@@ -573,14 +625,17 @@
     </w:p>
     <w:p>
       <w:pPr>
+        <w:spacing w:line="360" w:lineRule="auto"/>
         <w:ind w:left="360"/>
         <w:rPr>
-          <w:sz w:val="26"/>
-          <w:szCs w:val="26"/>
-        </w:rPr>
-      </w:pPr>
-      <w:r>
-        <w:rPr>
+          <w:rFonts w:ascii="Times New Roman" w:hAnsi="Times New Roman" w:cs="Times New Roman"/>
+          <w:sz w:val="26"/>
+          <w:szCs w:val="26"/>
+        </w:rPr>
+      </w:pPr>
+      <w:r>
+        <w:rPr>
+          <w:rFonts w:ascii="Times New Roman" w:hAnsi="Times New Roman" w:cs="Times New Roman"/>
           <w:sz w:val="26"/>
           <w:szCs w:val="26"/>
         </w:rPr>
@@ -588,6 +643,7 @@
       </w:r>
       <w:r>
         <w:rPr>
+          <w:rFonts w:ascii="Times New Roman" w:hAnsi="Times New Roman" w:cs="Times New Roman"/>
           <w:sz w:val="26"/>
           <w:szCs w:val="26"/>
         </w:rPr>
@@ -595,6 +651,7 @@
       </w:r>
       <w:r>
         <w:rPr>
+          <w:rFonts w:ascii="Times New Roman" w:hAnsi="Times New Roman" w:cs="Times New Roman"/>
           <w:sz w:val="26"/>
           <w:szCs w:val="26"/>
         </w:rPr>
@@ -603,14 +660,17 @@
     </w:p>
     <w:p>
       <w:pPr>
+        <w:spacing w:line="360" w:lineRule="auto"/>
         <w:ind w:left="360"/>
         <w:rPr>
-          <w:sz w:val="26"/>
-          <w:szCs w:val="26"/>
-        </w:rPr>
-      </w:pPr>
-      <w:r>
-        <w:rPr>
+          <w:rFonts w:ascii="Times New Roman" w:hAnsi="Times New Roman" w:cs="Times New Roman"/>
+          <w:sz w:val="26"/>
+          <w:szCs w:val="26"/>
+        </w:rPr>
+      </w:pPr>
+      <w:r>
+        <w:rPr>
+          <w:rFonts w:ascii="Times New Roman" w:hAnsi="Times New Roman" w:cs="Times New Roman"/>
           <w:sz w:val="26"/>
           <w:szCs w:val="26"/>
         </w:rPr>
@@ -619,14 +679,17 @@
     </w:p>
     <w:p>
       <w:pPr>
+        <w:spacing w:line="360" w:lineRule="auto"/>
         <w:ind w:left="360"/>
         <w:rPr>
-          <w:sz w:val="26"/>
-          <w:szCs w:val="26"/>
-        </w:rPr>
-      </w:pPr>
-      <w:r>
-        <w:rPr>
+          <w:rFonts w:ascii="Times New Roman" w:hAnsi="Times New Roman" w:cs="Times New Roman"/>
+          <w:sz w:val="26"/>
+          <w:szCs w:val="26"/>
+        </w:rPr>
+      </w:pPr>
+      <w:r>
+        <w:rPr>
+          <w:rFonts w:ascii="Times New Roman" w:hAnsi="Times New Roman" w:cs="Times New Roman"/>
           <w:sz w:val="26"/>
           <w:szCs w:val="26"/>
         </w:rPr>
@@ -635,14 +698,17 @@
     </w:p>
     <w:p>
       <w:pPr>
+        <w:spacing w:line="360" w:lineRule="auto"/>
         <w:ind w:left="360"/>
         <w:rPr>
-          <w:sz w:val="26"/>
-          <w:szCs w:val="26"/>
-        </w:rPr>
-      </w:pPr>
-      <w:r>
-        <w:rPr>
+          <w:rFonts w:ascii="Times New Roman" w:hAnsi="Times New Roman" w:cs="Times New Roman"/>
+          <w:sz w:val="26"/>
+          <w:szCs w:val="26"/>
+        </w:rPr>
+      </w:pPr>
+      <w:r>
+        <w:rPr>
+          <w:rFonts w:ascii="Times New Roman" w:hAnsi="Times New Roman" w:cs="Times New Roman"/>
           <w:sz w:val="26"/>
           <w:szCs w:val="26"/>
         </w:rPr>
@@ -650,6 +716,7 @@
       </w:r>
       <w:r>
         <w:rPr>
+          <w:rFonts w:ascii="Times New Roman" w:hAnsi="Times New Roman" w:cs="Times New Roman"/>
           <w:sz w:val="26"/>
           <w:szCs w:val="26"/>
         </w:rPr>
@@ -657,6 +724,7 @@
       </w:r>
       <w:r>
         <w:rPr>
+          <w:rFonts w:ascii="Times New Roman" w:hAnsi="Times New Roman" w:cs="Times New Roman"/>
           <w:sz w:val="26"/>
           <w:szCs w:val="26"/>
         </w:rPr>
@@ -665,14 +733,17 @@
     </w:p>
     <w:p>
       <w:pPr>
+        <w:spacing w:line="360" w:lineRule="auto"/>
         <w:ind w:left="360"/>
         <w:rPr>
-          <w:sz w:val="26"/>
-          <w:szCs w:val="26"/>
-        </w:rPr>
-      </w:pPr>
-      <w:r>
-        <w:rPr>
+          <w:rFonts w:ascii="Times New Roman" w:hAnsi="Times New Roman" w:cs="Times New Roman"/>
+          <w:sz w:val="26"/>
+          <w:szCs w:val="26"/>
+        </w:rPr>
+      </w:pPr>
+      <w:r>
+        <w:rPr>
+          <w:rFonts w:ascii="Times New Roman" w:hAnsi="Times New Roman" w:cs="Times New Roman"/>
           <w:sz w:val="26"/>
           <w:szCs w:val="26"/>
         </w:rPr>
@@ -680,6 +751,7 @@
       </w:r>
       <w:r>
         <w:rPr>
+          <w:rFonts w:ascii="Times New Roman" w:hAnsi="Times New Roman" w:cs="Times New Roman"/>
           <w:sz w:val="26"/>
           <w:szCs w:val="26"/>
         </w:rPr>
@@ -688,14 +760,17 @@
     </w:p>
     <w:p>
       <w:pPr>
+        <w:spacing w:line="360" w:lineRule="auto"/>
         <w:ind w:left="360"/>
         <w:rPr>
-          <w:sz w:val="26"/>
-          <w:szCs w:val="26"/>
-        </w:rPr>
-      </w:pPr>
-      <w:r>
-        <w:rPr>
+          <w:rFonts w:ascii="Times New Roman" w:hAnsi="Times New Roman" w:cs="Times New Roman"/>
+          <w:sz w:val="26"/>
+          <w:szCs w:val="26"/>
+        </w:rPr>
+      </w:pPr>
+      <w:r>
+        <w:rPr>
+          <w:rFonts w:ascii="Times New Roman" w:hAnsi="Times New Roman" w:cs="Times New Roman"/>
           <w:sz w:val="26"/>
           <w:szCs w:val="26"/>
         </w:rPr>
@@ -704,29 +779,27 @@
     </w:p>
     <w:p>
       <w:pPr>
-        <w:rPr>
-          <w:lang w:val="en-US"/>
-        </w:rPr>
-      </w:pPr>
-    </w:p>
-    <w:p>
-      <w:pPr>
-        <w:rPr>
-          <w:lang w:val="en-US"/>
-        </w:rPr>
-      </w:pPr>
-    </w:p>
-    <w:p>
-      <w:pPr>
-        <w:rPr>
-          <w:b/>
-          <w:bCs/>
-          <w:sz w:val="26"/>
-          <w:szCs w:val="26"/>
-        </w:rPr>
-      </w:pPr>
-      <w:r>
-        <w:rPr>
+        <w:spacing w:line="360" w:lineRule="auto"/>
+        <w:rPr>
+          <w:rFonts w:ascii="Times New Roman" w:hAnsi="Times New Roman" w:cs="Times New Roman"/>
+          <w:lang w:val="en-US"/>
+        </w:rPr>
+      </w:pPr>
+    </w:p>
+    <w:p>
+      <w:pPr>
+        <w:spacing w:line="360" w:lineRule="auto"/>
+        <w:rPr>
+          <w:rFonts w:ascii="Times New Roman" w:hAnsi="Times New Roman" w:cs="Times New Roman"/>
+          <w:b/>
+          <w:bCs/>
+          <w:sz w:val="26"/>
+          <w:szCs w:val="26"/>
+        </w:rPr>
+      </w:pPr>
+      <w:r>
+        <w:rPr>
+          <w:rFonts w:ascii="Times New Roman" w:hAnsi="Times New Roman" w:cs="Times New Roman"/>
           <w:b/>
           <w:bCs/>
           <w:sz w:val="26"/>
@@ -737,6 +810,7 @@
       </w:r>
       <w:r>
         <w:rPr>
+          <w:rFonts w:ascii="Times New Roman" w:hAnsi="Times New Roman" w:cs="Times New Roman"/>
           <w:sz w:val="26"/>
           <w:szCs w:val="26"/>
           <w:lang w:val="en-US"/>
@@ -745,6 +819,7 @@
       </w:r>
       <w:r>
         <w:rPr>
+          <w:rFonts w:ascii="Times New Roman" w:hAnsi="Times New Roman" w:cs="Times New Roman"/>
           <w:b/>
           <w:bCs/>
           <w:sz w:val="26"/>
@@ -754,6 +829,7 @@
       </w:r>
       <w:r>
         <w:rPr>
+          <w:rFonts w:ascii="Times New Roman" w:hAnsi="Times New Roman" w:cs="Times New Roman"/>
           <w:b/>
           <w:bCs/>
           <w:sz w:val="26"/>
@@ -764,26 +840,18 @@
     </w:p>
     <w:p>
       <w:pPr>
-        <w:ind w:left="360"/>
-        <w:rPr>
-          <w:b/>
-          <w:bCs/>
-          <w:sz w:val="26"/>
-          <w:szCs w:val="26"/>
-        </w:rPr>
-      </w:pPr>
-    </w:p>
-    <w:p>
-      <w:pPr>
-        <w:rPr>
-          <w:b/>
-          <w:bCs/>
-          <w:sz w:val="26"/>
-          <w:szCs w:val="26"/>
-        </w:rPr>
-      </w:pPr>
-      <w:r>
-        <w:rPr>
+        <w:spacing w:line="360" w:lineRule="auto"/>
+        <w:rPr>
+          <w:rFonts w:ascii="Times New Roman" w:hAnsi="Times New Roman" w:cs="Times New Roman"/>
+          <w:b/>
+          <w:bCs/>
+          <w:sz w:val="26"/>
+          <w:szCs w:val="26"/>
+        </w:rPr>
+      </w:pPr>
+      <w:r>
+        <w:rPr>
+          <w:rFonts w:ascii="Times New Roman" w:hAnsi="Times New Roman" w:cs="Times New Roman"/>
           <w:b/>
           <w:bCs/>
           <w:sz w:val="26"/>
@@ -793,6 +861,7 @@
       </w:r>
       <w:r>
         <w:rPr>
+          <w:rFonts w:ascii="Times New Roman" w:hAnsi="Times New Roman" w:cs="Times New Roman"/>
           <w:b/>
           <w:bCs/>
           <w:sz w:val="26"/>
@@ -803,13 +872,16 @@
     </w:p>
     <w:p>
       <w:pPr>
-        <w:rPr>
-          <w:sz w:val="26"/>
-          <w:szCs w:val="26"/>
-        </w:rPr>
-      </w:pPr>
-      <w:r>
-        <w:rPr>
+        <w:spacing w:line="360" w:lineRule="auto"/>
+        <w:rPr>
+          <w:rFonts w:ascii="Times New Roman" w:hAnsi="Times New Roman" w:cs="Times New Roman"/>
+          <w:sz w:val="26"/>
+          <w:szCs w:val="26"/>
+        </w:rPr>
+      </w:pPr>
+      <w:r>
+        <w:rPr>
+          <w:rFonts w:ascii="Times New Roman" w:hAnsi="Times New Roman" w:cs="Times New Roman"/>
           <w:sz w:val="26"/>
           <w:szCs w:val="26"/>
         </w:rPr>
@@ -817,6 +889,7 @@
       </w:r>
       <w:r>
         <w:rPr>
+          <w:rFonts w:ascii="Times New Roman" w:hAnsi="Times New Roman" w:cs="Times New Roman"/>
           <w:b/>
           <w:bCs/>
           <w:sz w:val="26"/>
@@ -826,6 +899,7 @@
       </w:r>
       <w:r>
         <w:rPr>
+          <w:rFonts w:ascii="Times New Roman" w:hAnsi="Times New Roman" w:cs="Times New Roman"/>
           <w:sz w:val="26"/>
           <w:szCs w:val="26"/>
         </w:rPr>
@@ -834,16 +908,19 @@
     </w:p>
     <w:p>
       <w:pPr>
-        <w:rPr>
-          <w:b/>
-          <w:bCs/>
-          <w:sz w:val="26"/>
-          <w:szCs w:val="26"/>
-          <w:lang w:val="en-US"/>
-        </w:rPr>
-      </w:pPr>
-      <w:r>
-        <w:rPr>
+        <w:spacing w:line="360" w:lineRule="auto"/>
+        <w:rPr>
+          <w:rFonts w:ascii="Times New Roman" w:hAnsi="Times New Roman" w:cs="Times New Roman"/>
+          <w:b/>
+          <w:bCs/>
+          <w:sz w:val="26"/>
+          <w:szCs w:val="26"/>
+          <w:lang w:val="en-US"/>
+        </w:rPr>
+      </w:pPr>
+      <w:r>
+        <w:rPr>
+          <w:rFonts w:ascii="Times New Roman" w:hAnsi="Times New Roman" w:cs="Times New Roman"/>
           <w:b/>
           <w:bCs/>
           <w:sz w:val="26"/>
@@ -853,6 +930,7 @@
       </w:r>
       <w:r>
         <w:rPr>
+          <w:rFonts w:ascii="Times New Roman" w:hAnsi="Times New Roman" w:cs="Times New Roman"/>
           <w:b/>
           <w:bCs/>
           <w:sz w:val="26"/>
@@ -864,14 +942,17 @@
     </w:p>
     <w:p>
       <w:pPr>
-        <w:rPr>
-          <w:sz w:val="26"/>
-          <w:szCs w:val="26"/>
-          <w:lang w:val="en-US"/>
-        </w:rPr>
-      </w:pPr>
-      <w:r>
-        <w:rPr>
+        <w:spacing w:line="360" w:lineRule="auto"/>
+        <w:rPr>
+          <w:rFonts w:ascii="Times New Roman" w:hAnsi="Times New Roman" w:cs="Times New Roman"/>
+          <w:sz w:val="26"/>
+          <w:szCs w:val="26"/>
+          <w:lang w:val="en-US"/>
+        </w:rPr>
+      </w:pPr>
+      <w:r>
+        <w:rPr>
+          <w:rFonts w:ascii="Times New Roman" w:hAnsi="Times New Roman" w:cs="Times New Roman"/>
           <w:sz w:val="26"/>
           <w:szCs w:val="26"/>
           <w:lang w:val="en-US"/>
@@ -881,6 +962,7 @@
       <w:proofErr w:type="spellStart"/>
       <w:r>
         <w:rPr>
+          <w:rFonts w:ascii="Times New Roman" w:hAnsi="Times New Roman" w:cs="Times New Roman"/>
           <w:sz w:val="26"/>
           <w:szCs w:val="26"/>
           <w:lang w:val="en-US"/>
@@ -890,6 +972,7 @@
       <w:proofErr w:type="spellEnd"/>
       <w:r>
         <w:rPr>
+          <w:rFonts w:ascii="Times New Roman" w:hAnsi="Times New Roman" w:cs="Times New Roman"/>
           <w:sz w:val="26"/>
           <w:szCs w:val="26"/>
           <w:lang w:val="en-US"/>
@@ -899,6 +982,7 @@
       <w:proofErr w:type="spellStart"/>
       <w:r>
         <w:rPr>
+          <w:rFonts w:ascii="Times New Roman" w:hAnsi="Times New Roman" w:cs="Times New Roman"/>
           <w:sz w:val="26"/>
           <w:szCs w:val="26"/>
           <w:lang w:val="en-US"/>
@@ -908,6 +992,7 @@
       <w:proofErr w:type="spellEnd"/>
       <w:r>
         <w:rPr>
+          <w:rFonts w:ascii="Times New Roman" w:hAnsi="Times New Roman" w:cs="Times New Roman"/>
           <w:sz w:val="26"/>
           <w:szCs w:val="26"/>
           <w:lang w:val="en-US"/>
@@ -917,6 +1002,7 @@
       <w:proofErr w:type="spellStart"/>
       <w:r>
         <w:rPr>
+          <w:rFonts w:ascii="Times New Roman" w:hAnsi="Times New Roman" w:cs="Times New Roman"/>
           <w:sz w:val="26"/>
           <w:szCs w:val="26"/>
           <w:lang w:val="en-US"/>
@@ -926,6 +1012,7 @@
       <w:proofErr w:type="spellEnd"/>
       <w:r>
         <w:rPr>
+          <w:rFonts w:ascii="Times New Roman" w:hAnsi="Times New Roman" w:cs="Times New Roman"/>
           <w:sz w:val="26"/>
           <w:szCs w:val="26"/>
           <w:lang w:val="en-US"/>
@@ -935,6 +1022,7 @@
       <w:proofErr w:type="spellStart"/>
       <w:r>
         <w:rPr>
+          <w:rFonts w:ascii="Times New Roman" w:hAnsi="Times New Roman" w:cs="Times New Roman"/>
           <w:sz w:val="26"/>
           <w:szCs w:val="26"/>
           <w:lang w:val="en-US"/>
@@ -944,6 +1032,7 @@
       <w:proofErr w:type="spellEnd"/>
       <w:r>
         <w:rPr>
+          <w:rFonts w:ascii="Times New Roman" w:hAnsi="Times New Roman" w:cs="Times New Roman"/>
           <w:sz w:val="26"/>
           <w:szCs w:val="26"/>
           <w:lang w:val="en-US"/>
@@ -953,6 +1042,7 @@
       <w:proofErr w:type="spellStart"/>
       <w:r>
         <w:rPr>
+          <w:rFonts w:ascii="Times New Roman" w:hAnsi="Times New Roman" w:cs="Times New Roman"/>
           <w:sz w:val="26"/>
           <w:szCs w:val="26"/>
           <w:lang w:val="en-US"/>
@@ -962,6 +1052,7 @@
       <w:proofErr w:type="spellEnd"/>
       <w:r>
         <w:rPr>
+          <w:rFonts w:ascii="Times New Roman" w:hAnsi="Times New Roman" w:cs="Times New Roman"/>
           <w:sz w:val="26"/>
           <w:szCs w:val="26"/>
           <w:lang w:val="en-US"/>
@@ -970,6 +1061,7 @@
       </w:r>
       <w:r>
         <w:rPr>
+          <w:rFonts w:ascii="Times New Roman" w:hAnsi="Times New Roman" w:cs="Times New Roman"/>
           <w:sz w:val="26"/>
           <w:szCs w:val="26"/>
           <w:lang w:val="en-US"/>
@@ -978,6 +1070,7 @@
       </w:r>
       <w:r>
         <w:rPr>
+          <w:rFonts w:ascii="Times New Roman" w:hAnsi="Times New Roman" w:cs="Times New Roman"/>
           <w:sz w:val="26"/>
           <w:szCs w:val="26"/>
           <w:lang w:val="en-US"/>
@@ -987,6 +1080,7 @@
       <w:proofErr w:type="spellStart"/>
       <w:r>
         <w:rPr>
+          <w:rFonts w:ascii="Times New Roman" w:hAnsi="Times New Roman" w:cs="Times New Roman"/>
           <w:sz w:val="26"/>
           <w:szCs w:val="26"/>
           <w:lang w:val="en-US"/>
@@ -995,6 +1089,7 @@
       </w:r>
       <w:r>
         <w:rPr>
+          <w:rFonts w:ascii="Times New Roman" w:hAnsi="Times New Roman" w:cs="Times New Roman"/>
           <w:sz w:val="26"/>
           <w:szCs w:val="26"/>
           <w:lang w:val="en-US"/>
@@ -1004,6 +1099,7 @@
       <w:proofErr w:type="spellEnd"/>
       <w:r>
         <w:rPr>
+          <w:rFonts w:ascii="Times New Roman" w:hAnsi="Times New Roman" w:cs="Times New Roman"/>
           <w:sz w:val="26"/>
           <w:szCs w:val="26"/>
           <w:lang w:val="en-US"/>
@@ -1013,6 +1109,7 @@
       <w:proofErr w:type="spellStart"/>
       <w:r>
         <w:rPr>
+          <w:rFonts w:ascii="Times New Roman" w:hAnsi="Times New Roman" w:cs="Times New Roman"/>
           <w:sz w:val="26"/>
           <w:szCs w:val="26"/>
           <w:lang w:val="en-US"/>
@@ -1021,6 +1118,7 @@
       </w:r>
       <w:r>
         <w:rPr>
+          <w:rFonts w:ascii="Times New Roman" w:hAnsi="Times New Roman" w:cs="Times New Roman"/>
           <w:sz w:val="26"/>
           <w:szCs w:val="26"/>
           <w:lang w:val="en-US"/>
@@ -1030,6 +1128,7 @@
       <w:proofErr w:type="spellEnd"/>
       <w:r>
         <w:rPr>
+          <w:rFonts w:ascii="Times New Roman" w:hAnsi="Times New Roman" w:cs="Times New Roman"/>
           <w:sz w:val="26"/>
           <w:szCs w:val="26"/>
           <w:lang w:val="en-US"/>
@@ -1039,6 +1138,7 @@
       <w:proofErr w:type="spellStart"/>
       <w:r>
         <w:rPr>
+          <w:rFonts w:ascii="Times New Roman" w:hAnsi="Times New Roman" w:cs="Times New Roman"/>
           <w:sz w:val="26"/>
           <w:szCs w:val="26"/>
           <w:lang w:val="en-US"/>
@@ -1048,6 +1148,7 @@
       <w:proofErr w:type="spellEnd"/>
       <w:r>
         <w:rPr>
+          <w:rFonts w:ascii="Times New Roman" w:hAnsi="Times New Roman" w:cs="Times New Roman"/>
           <w:sz w:val="26"/>
           <w:szCs w:val="26"/>
           <w:lang w:val="en-US"/>
@@ -1057,6 +1158,7 @@
       <w:proofErr w:type="spellStart"/>
       <w:r>
         <w:rPr>
+          <w:rFonts w:ascii="Times New Roman" w:hAnsi="Times New Roman" w:cs="Times New Roman"/>
           <w:sz w:val="26"/>
           <w:szCs w:val="26"/>
           <w:lang w:val="en-US"/>
@@ -1066,6 +1168,7 @@
       <w:proofErr w:type="spellEnd"/>
       <w:r>
         <w:rPr>
+          <w:rFonts w:ascii="Times New Roman" w:hAnsi="Times New Roman" w:cs="Times New Roman"/>
           <w:sz w:val="26"/>
           <w:szCs w:val="26"/>
           <w:lang w:val="en-US"/>
@@ -1075,6 +1178,7 @@
       <w:proofErr w:type="spellStart"/>
       <w:r>
         <w:rPr>
+          <w:rFonts w:ascii="Times New Roman" w:hAnsi="Times New Roman" w:cs="Times New Roman"/>
           <w:sz w:val="26"/>
           <w:szCs w:val="26"/>
           <w:lang w:val="en-US"/>
@@ -1084,6 +1188,7 @@
       <w:proofErr w:type="spellEnd"/>
       <w:r>
         <w:rPr>
+          <w:rFonts w:ascii="Times New Roman" w:hAnsi="Times New Roman" w:cs="Times New Roman"/>
           <w:sz w:val="26"/>
           <w:szCs w:val="26"/>
           <w:lang w:val="en-US"/>
@@ -1093,6 +1198,7 @@
       <w:proofErr w:type="spellStart"/>
       <w:r>
         <w:rPr>
+          <w:rFonts w:ascii="Times New Roman" w:hAnsi="Times New Roman" w:cs="Times New Roman"/>
           <w:sz w:val="26"/>
           <w:szCs w:val="26"/>
           <w:lang w:val="en-US"/>
@@ -1102,6 +1208,7 @@
       <w:proofErr w:type="spellEnd"/>
       <w:r>
         <w:rPr>
+          <w:rFonts w:ascii="Times New Roman" w:hAnsi="Times New Roman" w:cs="Times New Roman"/>
           <w:sz w:val="26"/>
           <w:szCs w:val="26"/>
           <w:lang w:val="en-US"/>
@@ -1111,6 +1218,7 @@
       <w:proofErr w:type="spellStart"/>
       <w:r>
         <w:rPr>
+          <w:rFonts w:ascii="Times New Roman" w:hAnsi="Times New Roman" w:cs="Times New Roman"/>
           <w:sz w:val="26"/>
           <w:szCs w:val="26"/>
           <w:lang w:val="en-US"/>
@@ -1120,6 +1228,7 @@
       <w:proofErr w:type="spellEnd"/>
       <w:r>
         <w:rPr>
+          <w:rFonts w:ascii="Times New Roman" w:hAnsi="Times New Roman" w:cs="Times New Roman"/>
           <w:sz w:val="26"/>
           <w:szCs w:val="26"/>
           <w:lang w:val="en-US"/>
@@ -1129,6 +1238,7 @@
       <w:proofErr w:type="spellStart"/>
       <w:r>
         <w:rPr>
+          <w:rFonts w:ascii="Times New Roman" w:hAnsi="Times New Roman" w:cs="Times New Roman"/>
           <w:sz w:val="26"/>
           <w:szCs w:val="26"/>
           <w:lang w:val="en-US"/>
@@ -1138,6 +1248,7 @@
       <w:proofErr w:type="spellEnd"/>
       <w:r>
         <w:rPr>
+          <w:rFonts w:ascii="Times New Roman" w:hAnsi="Times New Roman" w:cs="Times New Roman"/>
           <w:sz w:val="26"/>
           <w:szCs w:val="26"/>
           <w:lang w:val="en-US"/>
@@ -1147,6 +1258,7 @@
       <w:proofErr w:type="spellStart"/>
       <w:r>
         <w:rPr>
+          <w:rFonts w:ascii="Times New Roman" w:hAnsi="Times New Roman" w:cs="Times New Roman"/>
           <w:sz w:val="26"/>
           <w:szCs w:val="26"/>
           <w:lang w:val="en-US"/>
@@ -1156,6 +1268,7 @@
       <w:proofErr w:type="spellEnd"/>
       <w:r>
         <w:rPr>
+          <w:rFonts w:ascii="Times New Roman" w:hAnsi="Times New Roman" w:cs="Times New Roman"/>
           <w:sz w:val="26"/>
           <w:szCs w:val="26"/>
           <w:lang w:val="en-US"/>
@@ -1165,6 +1278,7 @@
       <w:proofErr w:type="spellStart"/>
       <w:r>
         <w:rPr>
+          <w:rFonts w:ascii="Times New Roman" w:hAnsi="Times New Roman" w:cs="Times New Roman"/>
           <w:sz w:val="26"/>
           <w:szCs w:val="26"/>
           <w:lang w:val="en-US"/>
@@ -1174,6 +1288,7 @@
       <w:proofErr w:type="spellEnd"/>
       <w:r>
         <w:rPr>
+          <w:rFonts w:ascii="Times New Roman" w:hAnsi="Times New Roman" w:cs="Times New Roman"/>
           <w:sz w:val="26"/>
           <w:szCs w:val="26"/>
           <w:lang w:val="en-US"/>
@@ -1183,6 +1298,7 @@
       <w:proofErr w:type="spellStart"/>
       <w:r>
         <w:rPr>
+          <w:rFonts w:ascii="Times New Roman" w:hAnsi="Times New Roman" w:cs="Times New Roman"/>
           <w:sz w:val="26"/>
           <w:szCs w:val="26"/>
           <w:lang w:val="en-US"/>
@@ -1192,6 +1308,7 @@
       <w:proofErr w:type="spellEnd"/>
       <w:r>
         <w:rPr>
+          <w:rFonts w:ascii="Times New Roman" w:hAnsi="Times New Roman" w:cs="Times New Roman"/>
           <w:sz w:val="26"/>
           <w:szCs w:val="26"/>
           <w:lang w:val="en-US"/>
@@ -1201,6 +1318,7 @@
       <w:proofErr w:type="spellStart"/>
       <w:r>
         <w:rPr>
+          <w:rFonts w:ascii="Times New Roman" w:hAnsi="Times New Roman" w:cs="Times New Roman"/>
           <w:sz w:val="26"/>
           <w:szCs w:val="26"/>
           <w:lang w:val="en-US"/>
@@ -1210,6 +1328,7 @@
       <w:proofErr w:type="spellEnd"/>
       <w:r>
         <w:rPr>
+          <w:rFonts w:ascii="Times New Roman" w:hAnsi="Times New Roman" w:cs="Times New Roman"/>
           <w:sz w:val="26"/>
           <w:szCs w:val="26"/>
           <w:lang w:val="en-US"/>
@@ -1219,6 +1338,7 @@
       <w:proofErr w:type="spellStart"/>
       <w:r>
         <w:rPr>
+          <w:rFonts w:ascii="Times New Roman" w:hAnsi="Times New Roman" w:cs="Times New Roman"/>
           <w:sz w:val="26"/>
           <w:szCs w:val="26"/>
           <w:lang w:val="en-US"/>
@@ -1228,6 +1348,7 @@
       <w:proofErr w:type="spellEnd"/>
       <w:r>
         <w:rPr>
+          <w:rFonts w:ascii="Times New Roman" w:hAnsi="Times New Roman" w:cs="Times New Roman"/>
           <w:sz w:val="26"/>
           <w:szCs w:val="26"/>
           <w:lang w:val="en-US"/>
@@ -1237,6 +1358,7 @@
       <w:proofErr w:type="spellStart"/>
       <w:r>
         <w:rPr>
+          <w:rFonts w:ascii="Times New Roman" w:hAnsi="Times New Roman" w:cs="Times New Roman"/>
           <w:sz w:val="26"/>
           <w:szCs w:val="26"/>
           <w:lang w:val="en-US"/>
@@ -1246,6 +1368,7 @@
       <w:proofErr w:type="spellEnd"/>
       <w:r>
         <w:rPr>
+          <w:rFonts w:ascii="Times New Roman" w:hAnsi="Times New Roman" w:cs="Times New Roman"/>
           <w:sz w:val="26"/>
           <w:szCs w:val="26"/>
           <w:lang w:val="en-US"/>
@@ -1255,6 +1378,7 @@
       <w:proofErr w:type="spellStart"/>
       <w:r>
         <w:rPr>
+          <w:rFonts w:ascii="Times New Roman" w:hAnsi="Times New Roman" w:cs="Times New Roman"/>
           <w:sz w:val="26"/>
           <w:szCs w:val="26"/>
           <w:lang w:val="en-US"/>
@@ -1264,6 +1388,7 @@
       <w:proofErr w:type="spellEnd"/>
       <w:r>
         <w:rPr>
+          <w:rFonts w:ascii="Times New Roman" w:hAnsi="Times New Roman" w:cs="Times New Roman"/>
           <w:sz w:val="26"/>
           <w:szCs w:val="26"/>
           <w:lang w:val="en-US"/>
@@ -1273,6 +1398,7 @@
       <w:proofErr w:type="spellStart"/>
       <w:r>
         <w:rPr>
+          <w:rFonts w:ascii="Times New Roman" w:hAnsi="Times New Roman" w:cs="Times New Roman"/>
           <w:sz w:val="26"/>
           <w:szCs w:val="26"/>
           <w:lang w:val="en-US"/>
@@ -1282,6 +1408,7 @@
       <w:proofErr w:type="spellEnd"/>
       <w:r>
         <w:rPr>
+          <w:rFonts w:ascii="Times New Roman" w:hAnsi="Times New Roman" w:cs="Times New Roman"/>
           <w:sz w:val="26"/>
           <w:szCs w:val="26"/>
           <w:lang w:val="en-US"/>
@@ -1291,6 +1418,7 @@
       <w:proofErr w:type="spellStart"/>
       <w:r>
         <w:rPr>
+          <w:rFonts w:ascii="Times New Roman" w:hAnsi="Times New Roman" w:cs="Times New Roman"/>
           <w:sz w:val="26"/>
           <w:szCs w:val="26"/>
           <w:lang w:val="en-US"/>
@@ -1300,6 +1428,7 @@
       <w:proofErr w:type="spellEnd"/>
       <w:r>
         <w:rPr>
+          <w:rFonts w:ascii="Times New Roman" w:hAnsi="Times New Roman" w:cs="Times New Roman"/>
           <w:sz w:val="26"/>
           <w:szCs w:val="26"/>
           <w:lang w:val="en-US"/>
@@ -1309,6 +1438,7 @@
       <w:proofErr w:type="spellStart"/>
       <w:r>
         <w:rPr>
+          <w:rFonts w:ascii="Times New Roman" w:hAnsi="Times New Roman" w:cs="Times New Roman"/>
           <w:sz w:val="26"/>
           <w:szCs w:val="26"/>
           <w:lang w:val="en-US"/>
@@ -1318,6 +1448,7 @@
       <w:proofErr w:type="spellEnd"/>
       <w:r>
         <w:rPr>
+          <w:rFonts w:ascii="Times New Roman" w:hAnsi="Times New Roman" w:cs="Times New Roman"/>
           <w:sz w:val="26"/>
           <w:szCs w:val="26"/>
           <w:lang w:val="en-US"/>
@@ -1327,6 +1458,7 @@
       <w:proofErr w:type="spellStart"/>
       <w:r>
         <w:rPr>
+          <w:rFonts w:ascii="Times New Roman" w:hAnsi="Times New Roman" w:cs="Times New Roman"/>
           <w:sz w:val="26"/>
           <w:szCs w:val="26"/>
           <w:lang w:val="en-US"/>
@@ -1336,6 +1468,7 @@
       <w:proofErr w:type="spellEnd"/>
       <w:r>
         <w:rPr>
+          <w:rFonts w:ascii="Times New Roman" w:hAnsi="Times New Roman" w:cs="Times New Roman"/>
           <w:sz w:val="26"/>
           <w:szCs w:val="26"/>
           <w:lang w:val="en-US"/>
@@ -1345,6 +1478,7 @@
       <w:proofErr w:type="spellStart"/>
       <w:r>
         <w:rPr>
+          <w:rFonts w:ascii="Times New Roman" w:hAnsi="Times New Roman" w:cs="Times New Roman"/>
           <w:sz w:val="26"/>
           <w:szCs w:val="26"/>
           <w:lang w:val="en-US"/>
@@ -1354,6 +1488,7 @@
       <w:proofErr w:type="spellEnd"/>
       <w:r>
         <w:rPr>
+          <w:rFonts w:ascii="Times New Roman" w:hAnsi="Times New Roman" w:cs="Times New Roman"/>
           <w:sz w:val="26"/>
           <w:szCs w:val="26"/>
           <w:lang w:val="en-US"/>
@@ -1363,6 +1498,7 @@
       <w:proofErr w:type="spellStart"/>
       <w:r>
         <w:rPr>
+          <w:rFonts w:ascii="Times New Roman" w:hAnsi="Times New Roman" w:cs="Times New Roman"/>
           <w:sz w:val="26"/>
           <w:szCs w:val="26"/>
           <w:lang w:val="en-US"/>
@@ -1372,6 +1508,7 @@
       <w:proofErr w:type="spellEnd"/>
       <w:r>
         <w:rPr>
+          <w:rFonts w:ascii="Times New Roman" w:hAnsi="Times New Roman" w:cs="Times New Roman"/>
           <w:sz w:val="26"/>
           <w:szCs w:val="26"/>
           <w:lang w:val="en-US"/>
@@ -1381,6 +1518,7 @@
       <w:proofErr w:type="spellStart"/>
       <w:r>
         <w:rPr>
+          <w:rFonts w:ascii="Times New Roman" w:hAnsi="Times New Roman" w:cs="Times New Roman"/>
           <w:sz w:val="26"/>
           <w:szCs w:val="26"/>
           <w:lang w:val="en-US"/>
@@ -1390,6 +1528,7 @@
       <w:proofErr w:type="spellEnd"/>
       <w:r>
         <w:rPr>
+          <w:rFonts w:ascii="Times New Roman" w:hAnsi="Times New Roman" w:cs="Times New Roman"/>
           <w:sz w:val="26"/>
           <w:szCs w:val="26"/>
           <w:lang w:val="en-US"/>
@@ -1399,6 +1538,7 @@
       <w:proofErr w:type="spellStart"/>
       <w:r>
         <w:rPr>
+          <w:rFonts w:ascii="Times New Roman" w:hAnsi="Times New Roman" w:cs="Times New Roman"/>
           <w:sz w:val="26"/>
           <w:szCs w:val="26"/>
           <w:lang w:val="en-US"/>
@@ -1408,6 +1548,7 @@
       <w:proofErr w:type="spellEnd"/>
       <w:r>
         <w:rPr>
+          <w:rFonts w:ascii="Times New Roman" w:hAnsi="Times New Roman" w:cs="Times New Roman"/>
           <w:sz w:val="26"/>
           <w:szCs w:val="26"/>
           <w:lang w:val="en-US"/>
@@ -1417,6 +1558,7 @@
       <w:proofErr w:type="spellStart"/>
       <w:r>
         <w:rPr>
+          <w:rFonts w:ascii="Times New Roman" w:hAnsi="Times New Roman" w:cs="Times New Roman"/>
           <w:sz w:val="26"/>
           <w:szCs w:val="26"/>
           <w:lang w:val="en-US"/>
@@ -1426,6 +1568,7 @@
       <w:proofErr w:type="spellEnd"/>
       <w:r>
         <w:rPr>
+          <w:rFonts w:ascii="Times New Roman" w:hAnsi="Times New Roman" w:cs="Times New Roman"/>
           <w:sz w:val="26"/>
           <w:szCs w:val="26"/>
           <w:lang w:val="en-US"/>
@@ -1435,6 +1578,7 @@
       <w:proofErr w:type="spellStart"/>
       <w:r>
         <w:rPr>
+          <w:rFonts w:ascii="Times New Roman" w:hAnsi="Times New Roman" w:cs="Times New Roman"/>
           <w:sz w:val="26"/>
           <w:szCs w:val="26"/>
           <w:lang w:val="en-US"/>
@@ -1444,6 +1588,7 @@
       <w:proofErr w:type="spellEnd"/>
       <w:r>
         <w:rPr>
+          <w:rFonts w:ascii="Times New Roman" w:hAnsi="Times New Roman" w:cs="Times New Roman"/>
           <w:sz w:val="26"/>
           <w:szCs w:val="26"/>
           <w:lang w:val="en-US"/>
@@ -1453,6 +1598,7 @@
       <w:proofErr w:type="spellStart"/>
       <w:r>
         <w:rPr>
+          <w:rFonts w:ascii="Times New Roman" w:hAnsi="Times New Roman" w:cs="Times New Roman"/>
           <w:sz w:val="26"/>
           <w:szCs w:val="26"/>
           <w:lang w:val="en-US"/>
@@ -1462,6 +1608,7 @@
       <w:proofErr w:type="spellEnd"/>
       <w:r>
         <w:rPr>
+          <w:rFonts w:ascii="Times New Roman" w:hAnsi="Times New Roman" w:cs="Times New Roman"/>
           <w:sz w:val="26"/>
           <w:szCs w:val="26"/>
           <w:lang w:val="en-US"/>
@@ -1471,6 +1618,7 @@
       <w:proofErr w:type="spellStart"/>
       <w:r>
         <w:rPr>
+          <w:rFonts w:ascii="Times New Roman" w:hAnsi="Times New Roman" w:cs="Times New Roman"/>
           <w:sz w:val="26"/>
           <w:szCs w:val="26"/>
           <w:lang w:val="en-US"/>
@@ -1480,6 +1628,7 @@
       <w:proofErr w:type="spellEnd"/>
       <w:r>
         <w:rPr>
+          <w:rFonts w:ascii="Times New Roman" w:hAnsi="Times New Roman" w:cs="Times New Roman"/>
           <w:sz w:val="26"/>
           <w:szCs w:val="26"/>
           <w:lang w:val="en-US"/>
@@ -1489,15 +1638,18 @@
     </w:p>
     <w:p>
       <w:pPr>
-        <w:rPr>
-          <w:b/>
-          <w:bCs/>
-          <w:sz w:val="26"/>
-          <w:szCs w:val="26"/>
-        </w:rPr>
-      </w:pPr>
-      <w:r>
-        <w:rPr>
+        <w:spacing w:line="360" w:lineRule="auto"/>
+        <w:rPr>
+          <w:rFonts w:ascii="Times New Roman" w:hAnsi="Times New Roman" w:cs="Times New Roman"/>
+          <w:b/>
+          <w:bCs/>
+          <w:sz w:val="26"/>
+          <w:szCs w:val="26"/>
+        </w:rPr>
+      </w:pPr>
+      <w:r>
+        <w:rPr>
+          <w:rFonts w:ascii="Times New Roman" w:hAnsi="Times New Roman" w:cs="Times New Roman"/>
           <w:b/>
           <w:bCs/>
           <w:sz w:val="26"/>
@@ -1507,6 +1659,7 @@
       </w:r>
       <w:r>
         <w:rPr>
+          <w:rFonts w:ascii="Times New Roman" w:hAnsi="Times New Roman" w:cs="Times New Roman"/>
           <w:b/>
           <w:bCs/>
           <w:sz w:val="26"/>
@@ -1517,13 +1670,16 @@
     </w:p>
     <w:p>
       <w:pPr>
-        <w:rPr>
-          <w:sz w:val="26"/>
-          <w:szCs w:val="26"/>
-        </w:rPr>
-      </w:pPr>
-      <w:r>
-        <w:rPr>
+        <w:spacing w:line="360" w:lineRule="auto"/>
+        <w:rPr>
+          <w:rFonts w:ascii="Times New Roman" w:hAnsi="Times New Roman" w:cs="Times New Roman"/>
+          <w:sz w:val="26"/>
+          <w:szCs w:val="26"/>
+        </w:rPr>
+      </w:pPr>
+      <w:r>
+        <w:rPr>
+          <w:rFonts w:ascii="Times New Roman" w:hAnsi="Times New Roman" w:cs="Times New Roman"/>
           <w:sz w:val="26"/>
           <w:szCs w:val="26"/>
         </w:rPr>
@@ -1532,27 +1688,26 @@
     </w:p>
     <w:p>
       <w:pPr>
-        <w:rPr>
-          <w:sz w:val="26"/>
-          <w:szCs w:val="26"/>
-        </w:rPr>
-      </w:pPr>
-    </w:p>
-    <w:p/>
-    <w:p/>
-    <w:p/>
-    <w:p/>
-    <w:p>
-      <w:pPr>
-        <w:rPr>
-          <w:b/>
-          <w:bCs/>
-          <w:sz w:val="26"/>
-          <w:szCs w:val="26"/>
-        </w:rPr>
-      </w:pPr>
-      <w:r>
-        <w:rPr>
+        <w:spacing w:line="360" w:lineRule="auto"/>
+        <w:rPr>
+          <w:rFonts w:ascii="Times New Roman" w:hAnsi="Times New Roman" w:cs="Times New Roman"/>
+        </w:rPr>
+      </w:pPr>
+    </w:p>
+    <w:p>
+      <w:pPr>
+        <w:spacing w:line="360" w:lineRule="auto"/>
+        <w:rPr>
+          <w:rFonts w:ascii="Times New Roman" w:hAnsi="Times New Roman" w:cs="Times New Roman"/>
+          <w:b/>
+          <w:bCs/>
+          <w:sz w:val="26"/>
+          <w:szCs w:val="26"/>
+        </w:rPr>
+      </w:pPr>
+      <w:r>
+        <w:rPr>
+          <w:rFonts w:ascii="Times New Roman" w:hAnsi="Times New Roman" w:cs="Times New Roman"/>
           <w:b/>
           <w:bCs/>
           <w:sz w:val="26"/>
@@ -1562,6 +1717,7 @@
       </w:r>
       <w:r>
         <w:rPr>
+          <w:rFonts w:ascii="Times New Roman" w:hAnsi="Times New Roman" w:cs="Times New Roman"/>
           <w:b/>
           <w:bCs/>
           <w:sz w:val="26"/>
@@ -1572,26 +1728,19 @@
     </w:p>
     <w:p>
       <w:pPr>
-        <w:rPr>
-          <w:b/>
-          <w:bCs/>
-          <w:sz w:val="26"/>
-          <w:szCs w:val="26"/>
-        </w:rPr>
-      </w:pPr>
-    </w:p>
-    <w:p>
-      <w:pPr>
-        <w:rPr>
-          <w:b/>
-          <w:bCs/>
-          <w:sz w:val="26"/>
-          <w:szCs w:val="26"/>
-          <w:lang w:val="en-US"/>
-        </w:rPr>
-      </w:pPr>
-      <w:r>
-        <w:rPr>
+        <w:spacing w:line="360" w:lineRule="auto"/>
+        <w:rPr>
+          <w:rFonts w:ascii="Times New Roman" w:hAnsi="Times New Roman" w:cs="Times New Roman"/>
+          <w:b/>
+          <w:bCs/>
+          <w:sz w:val="26"/>
+          <w:szCs w:val="26"/>
+          <w:lang w:val="en-US"/>
+        </w:rPr>
+      </w:pPr>
+      <w:r>
+        <w:rPr>
+          <w:rFonts w:ascii="Times New Roman" w:hAnsi="Times New Roman" w:cs="Times New Roman"/>
           <w:b/>
           <w:bCs/>
           <w:sz w:val="26"/>
@@ -1601,6 +1750,7 @@
       </w:r>
       <w:r>
         <w:rPr>
+          <w:rFonts w:ascii="Times New Roman" w:hAnsi="Times New Roman" w:cs="Times New Roman"/>
           <w:b/>
           <w:bCs/>
           <w:sz w:val="26"/>
@@ -1612,13 +1762,16 @@
     </w:p>
     <w:p>
       <w:pPr>
-        <w:rPr>
-          <w:sz w:val="26"/>
-          <w:szCs w:val="26"/>
-        </w:rPr>
-      </w:pPr>
-      <w:r>
-        <w:rPr>
+        <w:spacing w:line="360" w:lineRule="auto"/>
+        <w:rPr>
+          <w:rFonts w:ascii="Times New Roman" w:hAnsi="Times New Roman" w:cs="Times New Roman"/>
+          <w:sz w:val="26"/>
+          <w:szCs w:val="26"/>
+        </w:rPr>
+      </w:pPr>
+      <w:r>
+        <w:rPr>
+          <w:rFonts w:ascii="Times New Roman" w:hAnsi="Times New Roman" w:cs="Times New Roman"/>
           <w:sz w:val="26"/>
           <w:szCs w:val="26"/>
         </w:rPr>
@@ -1626,6 +1779,7 @@
       </w:r>
       <w:r>
         <w:rPr>
+          <w:rFonts w:ascii="Times New Roman" w:hAnsi="Times New Roman" w:cs="Times New Roman"/>
           <w:sz w:val="26"/>
           <w:szCs w:val="26"/>
         </w:rPr>
@@ -1633,6 +1787,7 @@
       </w:r>
       <w:r>
         <w:rPr>
+          <w:rFonts w:ascii="Times New Roman" w:hAnsi="Times New Roman" w:cs="Times New Roman"/>
           <w:sz w:val="26"/>
           <w:szCs w:val="26"/>
         </w:rPr>
@@ -1640,6 +1795,7 @@
       </w:r>
       <w:r>
         <w:rPr>
+          <w:rFonts w:ascii="Times New Roman" w:hAnsi="Times New Roman" w:cs="Times New Roman"/>
           <w:sz w:val="26"/>
           <w:szCs w:val="26"/>
         </w:rPr>
@@ -1647,6 +1803,7 @@
       </w:r>
       <w:r>
         <w:rPr>
+          <w:rFonts w:ascii="Times New Roman" w:hAnsi="Times New Roman" w:cs="Times New Roman"/>
           <w:sz w:val="26"/>
           <w:szCs w:val="26"/>
         </w:rPr>
@@ -1654,6 +1811,7 @@
       </w:r>
       <w:r>
         <w:rPr>
+          <w:rFonts w:ascii="Times New Roman" w:hAnsi="Times New Roman" w:cs="Times New Roman"/>
           <w:sz w:val="26"/>
           <w:szCs w:val="26"/>
         </w:rPr>
@@ -1661,6 +1819,7 @@
       </w:r>
       <w:r>
         <w:rPr>
+          <w:rFonts w:ascii="Times New Roman" w:hAnsi="Times New Roman" w:cs="Times New Roman"/>
           <w:sz w:val="26"/>
           <w:szCs w:val="26"/>
         </w:rPr>
@@ -1668,6 +1827,7 @@
       </w:r>
       <w:r>
         <w:rPr>
+          <w:rFonts w:ascii="Times New Roman" w:hAnsi="Times New Roman" w:cs="Times New Roman"/>
           <w:sz w:val="26"/>
           <w:szCs w:val="26"/>
         </w:rPr>
@@ -1675,6 +1835,7 @@
       </w:r>
       <w:r>
         <w:rPr>
+          <w:rFonts w:ascii="Times New Roman" w:hAnsi="Times New Roman" w:cs="Times New Roman"/>
           <w:sz w:val="26"/>
           <w:szCs w:val="26"/>
         </w:rPr>
@@ -1682,6 +1843,7 @@
       </w:r>
       <w:r>
         <w:rPr>
+          <w:rFonts w:ascii="Times New Roman" w:hAnsi="Times New Roman" w:cs="Times New Roman"/>
           <w:sz w:val="26"/>
           <w:szCs w:val="26"/>
         </w:rPr>
@@ -1690,15 +1852,18 @@
     </w:p>
     <w:p>
       <w:pPr>
-        <w:rPr>
-          <w:b/>
-          <w:bCs/>
-          <w:sz w:val="26"/>
-          <w:szCs w:val="26"/>
-        </w:rPr>
-      </w:pPr>
-      <w:r>
-        <w:rPr>
+        <w:spacing w:line="360" w:lineRule="auto"/>
+        <w:rPr>
+          <w:rFonts w:ascii="Times New Roman" w:hAnsi="Times New Roman" w:cs="Times New Roman"/>
+          <w:b/>
+          <w:bCs/>
+          <w:sz w:val="26"/>
+          <w:szCs w:val="26"/>
+        </w:rPr>
+      </w:pPr>
+      <w:r>
+        <w:rPr>
+          <w:rFonts w:ascii="Times New Roman" w:hAnsi="Times New Roman" w:cs="Times New Roman"/>
           <w:b/>
           <w:bCs/>
           <w:sz w:val="26"/>
@@ -1708,6 +1873,7 @@
       </w:r>
       <w:r>
         <w:rPr>
+          <w:rFonts w:ascii="Times New Roman" w:hAnsi="Times New Roman" w:cs="Times New Roman"/>
           <w:b/>
           <w:bCs/>
           <w:sz w:val="26"/>
@@ -1717,6 +1883,7 @@
       </w:r>
       <w:r>
         <w:rPr>
+          <w:rFonts w:ascii="Times New Roman" w:hAnsi="Times New Roman" w:cs="Times New Roman"/>
           <w:b/>
           <w:bCs/>
           <w:sz w:val="26"/>
@@ -1727,13 +1894,16 @@
     </w:p>
     <w:p>
       <w:pPr>
-        <w:rPr>
-          <w:sz w:val="26"/>
-          <w:szCs w:val="26"/>
-        </w:rPr>
-      </w:pPr>
-      <w:r>
-        <w:rPr>
+        <w:spacing w:line="360" w:lineRule="auto"/>
+        <w:rPr>
+          <w:rFonts w:ascii="Times New Roman" w:hAnsi="Times New Roman" w:cs="Times New Roman"/>
+          <w:sz w:val="26"/>
+          <w:szCs w:val="26"/>
+        </w:rPr>
+      </w:pPr>
+      <w:r>
+        <w:rPr>
+          <w:rFonts w:ascii="Times New Roman" w:hAnsi="Times New Roman" w:cs="Times New Roman"/>
           <w:sz w:val="26"/>
           <w:szCs w:val="26"/>
         </w:rPr>
@@ -1741,6 +1911,7 @@
       </w:r>
       <w:r>
         <w:rPr>
+          <w:rFonts w:ascii="Times New Roman" w:hAnsi="Times New Roman" w:cs="Times New Roman"/>
           <w:sz w:val="26"/>
           <w:szCs w:val="26"/>
         </w:rPr>
@@ -1748,6 +1919,7 @@
       </w:r>
       <w:r>
         <w:rPr>
+          <w:rFonts w:ascii="Times New Roman" w:hAnsi="Times New Roman" w:cs="Times New Roman"/>
           <w:sz w:val="26"/>
           <w:szCs w:val="26"/>
         </w:rPr>
@@ -1755,6 +1927,7 @@
       </w:r>
       <w:r>
         <w:rPr>
+          <w:rFonts w:ascii="Times New Roman" w:hAnsi="Times New Roman" w:cs="Times New Roman"/>
           <w:sz w:val="26"/>
           <w:szCs w:val="26"/>
         </w:rPr>
@@ -1762,6 +1935,7 @@
       </w:r>
       <w:r>
         <w:rPr>
+          <w:rFonts w:ascii="Times New Roman" w:hAnsi="Times New Roman" w:cs="Times New Roman"/>
           <w:sz w:val="26"/>
           <w:szCs w:val="26"/>
         </w:rPr>
@@ -1769,6 +1943,7 @@
       </w:r>
       <w:r>
         <w:rPr>
+          <w:rFonts w:ascii="Times New Roman" w:hAnsi="Times New Roman" w:cs="Times New Roman"/>
           <w:sz w:val="26"/>
           <w:szCs w:val="26"/>
         </w:rPr>
@@ -1776,6 +1951,7 @@
       </w:r>
       <w:r>
         <w:rPr>
+          <w:rFonts w:ascii="Times New Roman" w:hAnsi="Times New Roman" w:cs="Times New Roman"/>
           <w:sz w:val="26"/>
           <w:szCs w:val="26"/>
         </w:rPr>
@@ -1784,16 +1960,19 @@
     </w:p>
     <w:p>
       <w:pPr>
-        <w:rPr>
-          <w:b/>
-          <w:bCs/>
-          <w:sz w:val="26"/>
-          <w:szCs w:val="26"/>
-          <w:lang w:val="en-US"/>
-        </w:rPr>
-      </w:pPr>
-      <w:r>
-        <w:rPr>
+        <w:spacing w:line="360" w:lineRule="auto"/>
+        <w:rPr>
+          <w:rFonts w:ascii="Times New Roman" w:hAnsi="Times New Roman" w:cs="Times New Roman"/>
+          <w:b/>
+          <w:bCs/>
+          <w:sz w:val="26"/>
+          <w:szCs w:val="26"/>
+          <w:lang w:val="en-US"/>
+        </w:rPr>
+      </w:pPr>
+      <w:r>
+        <w:rPr>
+          <w:rFonts w:ascii="Times New Roman" w:hAnsi="Times New Roman" w:cs="Times New Roman"/>
           <w:b/>
           <w:bCs/>
           <w:sz w:val="26"/>
@@ -1803,6 +1982,7 @@
       </w:r>
       <w:r>
         <w:rPr>
+          <w:rFonts w:ascii="Times New Roman" w:hAnsi="Times New Roman" w:cs="Times New Roman"/>
           <w:b/>
           <w:bCs/>
           <w:sz w:val="26"/>
@@ -1814,13 +1994,16 @@
     </w:p>
     <w:p>
       <w:pPr>
-        <w:rPr>
-          <w:sz w:val="26"/>
-          <w:szCs w:val="26"/>
-        </w:rPr>
-      </w:pPr>
-      <w:r>
-        <w:rPr>
+        <w:spacing w:line="360" w:lineRule="auto"/>
+        <w:rPr>
+          <w:rFonts w:ascii="Times New Roman" w:hAnsi="Times New Roman" w:cs="Times New Roman"/>
+          <w:sz w:val="26"/>
+          <w:szCs w:val="26"/>
+        </w:rPr>
+      </w:pPr>
+      <w:r>
+        <w:rPr>
+          <w:rFonts w:ascii="Times New Roman" w:hAnsi="Times New Roman" w:cs="Times New Roman"/>
           <w:sz w:val="26"/>
           <w:szCs w:val="26"/>
         </w:rPr>
@@ -1828,6 +2011,7 @@
       </w:r>
       <w:r>
         <w:rPr>
+          <w:rFonts w:ascii="Times New Roman" w:hAnsi="Times New Roman" w:cs="Times New Roman"/>
           <w:sz w:val="26"/>
           <w:szCs w:val="26"/>
         </w:rPr>
@@ -1835,6 +2019,7 @@
       </w:r>
       <w:r>
         <w:rPr>
+          <w:rFonts w:ascii="Times New Roman" w:hAnsi="Times New Roman" w:cs="Times New Roman"/>
           <w:sz w:val="26"/>
           <w:szCs w:val="26"/>
         </w:rPr>
@@ -1842,6 +2027,7 @@
       </w:r>
       <w:r>
         <w:rPr>
+          <w:rFonts w:ascii="Times New Roman" w:hAnsi="Times New Roman" w:cs="Times New Roman"/>
           <w:sz w:val="26"/>
           <w:szCs w:val="26"/>
         </w:rPr>
@@ -1849,6 +2035,7 @@
       </w:r>
       <w:r>
         <w:rPr>
+          <w:rFonts w:ascii="Times New Roman" w:hAnsi="Times New Roman" w:cs="Times New Roman"/>
           <w:sz w:val="26"/>
           <w:szCs w:val="26"/>
         </w:rPr>
@@ -1856,6 +2043,7 @@
       </w:r>
       <w:r>
         <w:rPr>
+          <w:rFonts w:ascii="Times New Roman" w:hAnsi="Times New Roman" w:cs="Times New Roman"/>
           <w:sz w:val="26"/>
           <w:szCs w:val="26"/>
         </w:rPr>
@@ -1863,6 +2051,7 @@
       </w:r>
       <w:r>
         <w:rPr>
+          <w:rFonts w:ascii="Times New Roman" w:hAnsi="Times New Roman" w:cs="Times New Roman"/>
           <w:sz w:val="26"/>
           <w:szCs w:val="26"/>
         </w:rPr>
@@ -1870,6 +2059,7 @@
       </w:r>
       <w:r>
         <w:rPr>
+          <w:rFonts w:ascii="Times New Roman" w:hAnsi="Times New Roman" w:cs="Times New Roman"/>
           <w:sz w:val="26"/>
           <w:szCs w:val="26"/>
         </w:rPr>
@@ -1877,6 +2067,7 @@
       </w:r>
       <w:r>
         <w:rPr>
+          <w:rFonts w:ascii="Times New Roman" w:hAnsi="Times New Roman" w:cs="Times New Roman"/>
           <w:sz w:val="26"/>
           <w:szCs w:val="26"/>
         </w:rPr>
@@ -1885,13 +2076,16 @@
     </w:p>
     <w:p>
       <w:pPr>
-        <w:rPr>
+        <w:spacing w:line="360" w:lineRule="auto"/>
+        <w:rPr>
+          <w:rFonts w:ascii="Times New Roman" w:hAnsi="Times New Roman" w:cs="Times New Roman"/>
           <w:sz w:val="26"/>
           <w:szCs w:val="26"/>
         </w:rPr>
       </w:pPr>
     </w:p>
     <w:sectPr>
+      <w:footerReference w:type="default" r:id="rId7"/>
       <w:pgSz w:w="11906" w:h="16838"/>
       <w:pgMar w:top="1417" w:right="1417" w:bottom="1417" w:left="1417" w:header="708" w:footer="708" w:gutter="0"/>
       <w:cols w:space="708"/>
@@ -1899,6 +2093,119 @@
     </w:sectPr>
   </w:body>
 </w:document>
+</file>
+
+<file path=word/endnotes.xml><?xml version="1.0" encoding="utf-8"?>
+<w:endnotes xmlns:wpc="http://schemas.microsoft.com/office/word/2010/wordprocessingCanvas" xmlns:cx="http://schemas.microsoft.com/office/drawing/2014/chartex" xmlns:cx1="http://schemas.microsoft.com/office/drawing/2015/9/8/chartex" xmlns:cx2="http://schemas.microsoft.com/office/drawing/2015/10/21/chartex" xmlns:cx3="http://schemas.microsoft.com/office/drawing/2016/5/9/chartex" xmlns:cx4="http://schemas.microsoft.com/office/drawing/2016/5/10/chartex" xmlns:cx5="http://schemas.microsoft.com/office/drawing/2016/5/11/chartex" xmlns:cx6="http://schemas.microsoft.com/office/drawing/2016/5/12/chartex" xmlns:cx7="http://schemas.microsoft.com/office/drawing/2016/5/13/chartex" xmlns:cx8="http://schemas.microsoft.com/office/drawing/2016/5/14/chartex" xmlns:mc="http://schemas.openxmlformats.org/markup-compatibility/2006" xmlns:aink="http://schemas.microsoft.com/office/drawing/2016/ink" xmlns:am3d="http://schemas.microsoft.com/office/drawing/2017/model3d" xmlns:o="urn:schemas-microsoft-com:office:office" xmlns:oel="http://schemas.microsoft.com/office/2019/extlst" xmlns:r="http://schemas.openxmlformats.org/officeDocument/2006/relationships" xmlns:m="http://schemas.openxmlformats.org/officeDocument/2006/math" xmlns:v="urn:schemas-microsoft-com:vml" xmlns:wp14="http://schemas.microsoft.com/office/word/2010/wordprocessingDrawing" xmlns:wp="http://schemas.openxmlformats.org/drawingml/2006/wordprocessingDrawing" xmlns:w10="urn:schemas-microsoft-com:office:word" xmlns:w="http://schemas.openxmlformats.org/wordprocessingml/2006/main" xmlns:w14="http://schemas.microsoft.com/office/word/2010/wordml" xmlns:w15="http://schemas.microsoft.com/office/word/2012/wordml" xmlns:w16cex="http://schemas.microsoft.com/office/word/2018/wordml/cex" xmlns:w16cid="http://schemas.microsoft.com/office/word/2016/wordml/cid" xmlns:w16="http://schemas.microsoft.com/office/word/2018/wordml" xmlns:w16du="http://schemas.microsoft.com/office/word/2023/wordml/word16du" xmlns:w16sdtdh="http://schemas.microsoft.com/office/word/2020/wordml/sdtdatahash" xmlns:w16sdtfl="http://schemas.microsoft.com/office/word/2024/wordml/sdtformatlock" xmlns:w16se="http://schemas.microsoft.com/office/word/2015/wordml/symex" xmlns:wpg="http://schemas.microsoft.com/office/word/2010/wordprocessingGroup" xmlns:wpi="http://schemas.microsoft.com/office/word/2010/wordprocessingInk" xmlns:wne="http://schemas.microsoft.com/office/word/2006/wordml" xmlns:wps="http://schemas.microsoft.com/office/word/2010/wordprocessingShape" mc:Ignorable="w14 w15 w16se w16cid w16 w16cex w16sdtdh w16sdtfl w16du wp14">
+  <w:endnote w:type="separator" w:id="-1">
+    <w:p>
+      <w:pPr>
+        <w:spacing w:after="0" w:line="240" w:lineRule="auto"/>
+      </w:pPr>
+      <w:r>
+        <w:separator/>
+      </w:r>
+    </w:p>
+  </w:endnote>
+  <w:endnote w:type="continuationSeparator" w:id="0">
+    <w:p>
+      <w:pPr>
+        <w:spacing w:after="0" w:line="240" w:lineRule="auto"/>
+      </w:pPr>
+      <w:r>
+        <w:continuationSeparator/>
+      </w:r>
+    </w:p>
+  </w:endnote>
+</w:endnotes>
+</file>
+
+<file path=word/footer1.xml><?xml version="1.0" encoding="utf-8"?>
+<w:ftr xmlns:wpc="http://schemas.microsoft.com/office/word/2010/wordprocessingCanvas" xmlns:cx="http://schemas.microsoft.com/office/drawing/2014/chartex" xmlns:cx1="http://schemas.microsoft.com/office/drawing/2015/9/8/chartex" xmlns:cx2="http://schemas.microsoft.com/office/drawing/2015/10/21/chartex" xmlns:cx3="http://schemas.microsoft.com/office/drawing/2016/5/9/chartex" xmlns:cx4="http://schemas.microsoft.com/office/drawing/2016/5/10/chartex" xmlns:cx5="http://schemas.microsoft.com/office/drawing/2016/5/11/chartex" xmlns:cx6="http://schemas.microsoft.com/office/drawing/2016/5/12/chartex" xmlns:cx7="http://schemas.microsoft.com/office/drawing/2016/5/13/chartex" xmlns:cx8="http://schemas.microsoft.com/office/drawing/2016/5/14/chartex" xmlns:mc="http://schemas.openxmlformats.org/markup-compatibility/2006" xmlns:aink="http://schemas.microsoft.com/office/drawing/2016/ink" xmlns:am3d="http://schemas.microsoft.com/office/drawing/2017/model3d" xmlns:o="urn:schemas-microsoft-com:office:office" xmlns:oel="http://schemas.microsoft.com/office/2019/extlst" xmlns:r="http://schemas.openxmlformats.org/officeDocument/2006/relationships" xmlns:m="http://schemas.openxmlformats.org/officeDocument/2006/math" xmlns:v="urn:schemas-microsoft-com:vml" xmlns:wp14="http://schemas.microsoft.com/office/word/2010/wordprocessingDrawing" xmlns:wp="http://schemas.openxmlformats.org/drawingml/2006/wordprocessingDrawing" xmlns:w10="urn:schemas-microsoft-com:office:word" xmlns:w="http://schemas.openxmlformats.org/wordprocessingml/2006/main" xmlns:w14="http://schemas.microsoft.com/office/word/2010/wordml" xmlns:w15="http://schemas.microsoft.com/office/word/2012/wordml" xmlns:w16cex="http://schemas.microsoft.com/office/word/2018/wordml/cex" xmlns:w16cid="http://schemas.microsoft.com/office/word/2016/wordml/cid" xmlns:w16="http://schemas.microsoft.com/office/word/2018/wordml" xmlns:w16du="http://schemas.microsoft.com/office/word/2023/wordml/word16du" xmlns:w16sdtdh="http://schemas.microsoft.com/office/word/2020/wordml/sdtdatahash" xmlns:w16sdtfl="http://schemas.microsoft.com/office/word/2024/wordml/sdtformatlock" xmlns:w16se="http://schemas.microsoft.com/office/word/2015/wordml/symex" xmlns:wpg="http://schemas.microsoft.com/office/word/2010/wordprocessingGroup" xmlns:wpi="http://schemas.microsoft.com/office/word/2010/wordprocessingInk" xmlns:wne="http://schemas.microsoft.com/office/word/2006/wordml" xmlns:wps="http://schemas.microsoft.com/office/word/2010/wordprocessingShape" mc:Ignorable="w14 w15 w16se w16cid w16 w16cex w16sdtdh w16sdtfl w16du wp14">
+  <w:sdt>
+    <w:sdtPr>
+      <w:id w:val="2103901575"/>
+      <w:docPartObj>
+        <w:docPartGallery w:val="Page Numbers (Bottom of Page)"/>
+        <w:docPartUnique/>
+      </w:docPartObj>
+    </w:sdtPr>
+    <w:sdtContent>
+      <w:p>
+        <w:pPr>
+          <w:pStyle w:val="Subsol"/>
+          <w:jc w:val="right"/>
+        </w:pPr>
+        <w:r>
+          <w:rPr>
+            <w:rFonts w:ascii="Times New Roman" w:hAnsi="Times New Roman" w:cs="Times New Roman"/>
+          </w:rPr>
+          <w:fldChar w:fldCharType="begin"/>
+        </w:r>
+        <w:r>
+          <w:rPr>
+            <w:rFonts w:ascii="Times New Roman" w:hAnsi="Times New Roman" w:cs="Times New Roman"/>
+          </w:rPr>
+          <w:instrText>PAGE   \* MERGEFORMAT</w:instrText>
+        </w:r>
+        <w:r>
+          <w:rPr>
+            <w:rFonts w:ascii="Times New Roman" w:hAnsi="Times New Roman" w:cs="Times New Roman"/>
+          </w:rPr>
+          <w:fldChar w:fldCharType="separate"/>
+        </w:r>
+        <w:r>
+          <w:rPr>
+            <w:rFonts w:ascii="Times New Roman" w:hAnsi="Times New Roman" w:cs="Times New Roman"/>
+          </w:rPr>
+          <w:t>2</w:t>
+        </w:r>
+        <w:r>
+          <w:rPr>
+            <w:rFonts w:ascii="Times New Roman" w:hAnsi="Times New Roman" w:cs="Times New Roman"/>
+          </w:rPr>
+          <w:fldChar w:fldCharType="end"/>
+        </w:r>
+        <w:r>
+          <w:rPr>
+            <w:rFonts w:ascii="Times New Roman" w:hAnsi="Times New Roman" w:cs="Times New Roman"/>
+          </w:rPr>
+          <w:t>.</w:t>
+        </w:r>
+      </w:p>
+    </w:sdtContent>
+  </w:sdt>
+  <w:p>
+    <w:pPr>
+      <w:pStyle w:val="Subsol"/>
+    </w:pPr>
+  </w:p>
+</w:ftr>
+</file>
+
+<file path=word/footnotes.xml><?xml version="1.0" encoding="utf-8"?>
+<w:footnotes xmlns:wpc="http://schemas.microsoft.com/office/word/2010/wordprocessingCanvas" xmlns:cx="http://schemas.microsoft.com/office/drawing/2014/chartex" xmlns:cx1="http://schemas.microsoft.com/office/drawing/2015/9/8/chartex" xmlns:cx2="http://schemas.microsoft.com/office/drawing/2015/10/21/chartex" xmlns:cx3="http://schemas.microsoft.com/office/drawing/2016/5/9/chartex" xmlns:cx4="http://schemas.microsoft.com/office/drawing/2016/5/10/chartex" xmlns:cx5="http://schemas.microsoft.com/office/drawing/2016/5/11/chartex" xmlns:cx6="http://schemas.microsoft.com/office/drawing/2016/5/12/chartex" xmlns:cx7="http://schemas.microsoft.com/office/drawing/2016/5/13/chartex" xmlns:cx8="http://schemas.microsoft.com/office/drawing/2016/5/14/chartex" xmlns:mc="http://schemas.openxmlformats.org/markup-compatibility/2006" xmlns:aink="http://schemas.microsoft.com/office/drawing/2016/ink" xmlns:am3d="http://schemas.microsoft.com/office/drawing/2017/model3d" xmlns:o="urn:schemas-microsoft-com:office:office" xmlns:oel="http://schemas.microsoft.com/office/2019/extlst" xmlns:r="http://schemas.openxmlformats.org/officeDocument/2006/relationships" xmlns:m="http://schemas.openxmlformats.org/officeDocument/2006/math" xmlns:v="urn:schemas-microsoft-com:vml" xmlns:wp14="http://schemas.microsoft.com/office/word/2010/wordprocessingDrawing" xmlns:wp="http://schemas.openxmlformats.org/drawingml/2006/wordprocessingDrawing" xmlns:w10="urn:schemas-microsoft-com:office:word" xmlns:w="http://schemas.openxmlformats.org/wordprocessingml/2006/main" xmlns:w14="http://schemas.microsoft.com/office/word/2010/wordml" xmlns:w15="http://schemas.microsoft.com/office/word/2012/wordml" xmlns:w16cex="http://schemas.microsoft.com/office/word/2018/wordml/cex" xmlns:w16cid="http://schemas.microsoft.com/office/word/2016/wordml/cid" xmlns:w16="http://schemas.microsoft.com/office/word/2018/wordml" xmlns:w16du="http://schemas.microsoft.com/office/word/2023/wordml/word16du" xmlns:w16sdtdh="http://schemas.microsoft.com/office/word/2020/wordml/sdtdatahash" xmlns:w16sdtfl="http://schemas.microsoft.com/office/word/2024/wordml/sdtformatlock" xmlns:w16se="http://schemas.microsoft.com/office/word/2015/wordml/symex" xmlns:wpg="http://schemas.microsoft.com/office/word/2010/wordprocessingGroup" xmlns:wpi="http://schemas.microsoft.com/office/word/2010/wordprocessingInk" xmlns:wne="http://schemas.microsoft.com/office/word/2006/wordml" xmlns:wps="http://schemas.microsoft.com/office/word/2010/wordprocessingShape" mc:Ignorable="w14 w15 w16se w16cid w16 w16cex w16sdtdh w16sdtfl w16du wp14">
+  <w:footnote w:type="separator" w:id="-1">
+    <w:p>
+      <w:pPr>
+        <w:spacing w:after="0" w:line="240" w:lineRule="auto"/>
+      </w:pPr>
+      <w:r>
+        <w:separator/>
+      </w:r>
+    </w:p>
+  </w:footnote>
+  <w:footnote w:type="continuationSeparator" w:id="0">
+    <w:p>
+      <w:pPr>
+        <w:spacing w:after="0" w:line="240" w:lineRule="auto"/>
+      </w:pPr>
+      <w:r>
+        <w:continuationSeparator/>
+      </w:r>
+    </w:p>
+  </w:footnote>
+</w:footnotes>
 </file>
 
 <file path=word/numbering.xml><?xml version="1.0" encoding="utf-8"?>
@@ -3519,6 +3826,50 @@
       <w:spacing w:val="5"/>
     </w:rPr>
   </w:style>
+  <w:style w:type="paragraph" w:styleId="Antet">
+    <w:name w:val="header"/>
+    <w:basedOn w:val="Normal"/>
+    <w:link w:val="AntetCaracter"/>
+    <w:uiPriority w:val="99"/>
+    <w:unhideWhenUsed/>
+    <w:rsid w:val="007613E7"/>
+    <w:pPr>
+      <w:tabs>
+        <w:tab w:val="center" w:pos="4536"/>
+        <w:tab w:val="right" w:pos="9072"/>
+      </w:tabs>
+      <w:spacing w:after="0" w:line="240" w:lineRule="auto"/>
+    </w:pPr>
+  </w:style>
+  <w:style w:type="character" w:customStyle="1" w:styleId="AntetCaracter">
+    <w:name w:val="Antet Caracter"/>
+    <w:basedOn w:val="Fontdeparagrafimplicit"/>
+    <w:link w:val="Antet"/>
+    <w:uiPriority w:val="99"/>
+    <w:rsid w:val="007613E7"/>
+  </w:style>
+  <w:style w:type="paragraph" w:styleId="Subsol">
+    <w:name w:val="footer"/>
+    <w:basedOn w:val="Normal"/>
+    <w:link w:val="SubsolCaracter"/>
+    <w:uiPriority w:val="99"/>
+    <w:unhideWhenUsed/>
+    <w:rsid w:val="007613E7"/>
+    <w:pPr>
+      <w:tabs>
+        <w:tab w:val="center" w:pos="4536"/>
+        <w:tab w:val="right" w:pos="9072"/>
+      </w:tabs>
+      <w:spacing w:after="0" w:line="240" w:lineRule="auto"/>
+    </w:pPr>
+  </w:style>
+  <w:style w:type="character" w:customStyle="1" w:styleId="SubsolCaracter">
+    <w:name w:val="Subsol Caracter"/>
+    <w:basedOn w:val="Fontdeparagrafimplicit"/>
+    <w:link w:val="Subsol"/>
+    <w:uiPriority w:val="99"/>
+    <w:rsid w:val="007613E7"/>
+  </w:style>
 </w:styles>
 </file>
 

</xml_diff>